<commit_message>
Actualizo mis documentos de fase 1
</commit_message>
<xml_diff>
--- a/Fase 1/Evidencias Individuales/Cariqueo_Ariel_1.2_APT122_DiarioReflexionFase1.docx
+++ b/Fase 1/Evidencias Individuales/Cariqueo_Ariel_1.2_APT122_DiarioReflexionFase1.docx
@@ -319,7 +319,7 @@
                 <w:sz w:val="20"/>
                 <w:szCs w:val="20"/>
               </w:rPr>
-              <w:t>APT122 — Fase 1: Definición del Proyecto APT</w:t>
+              <w:t>APT122 — Fase 1</w:t>
             </w:r>
           </w:p>
         </w:tc>
@@ -400,7 +400,7 @@
                 <w:sz w:val="20"/>
                 <w:szCs w:val="20"/>
               </w:rPr>
-              <w:t>La 200 (ladoscientos.cl) — sistema de gestión, venta y retiro para el local de productos de limpieza de Mitzi, en una parcelación</w:t>
+              <w:t>La 200 (ladoscientos.cl)</w:t>
             </w:r>
           </w:p>
         </w:tc>
@@ -524,7 +524,7 @@
                 <w:sz w:val="20"/>
                 <w:szCs w:val="20"/>
               </w:rPr>
-              <w:t>Periodo que cubre este diario</w:t>
+              <w:t>Periodo</w:t>
             </w:r>
           </w:p>
         </w:tc>
@@ -664,7 +664,7 @@
           <w:rFonts w:ascii="Calibri" w:hAnsi="Calibri" w:cs="Calibri"/>
           <w:lang w:val="es-ES"/>
         </w:rPr>
-        <w:t>Los roles y el relato de este diario siguen la propuesta La200_Propuesta.pptx. Mitzi es la dueña; quienes usan el POS son los trabajadores mayores, no el equipo de título.</w:t>
+        <w:t>Este diario registra lo que hice yo. No reemplaza el diario de Joaquín (visión y priorización) ni el de Benjamín (pagos, pedidos y operación).</w:t>
       </w:r>
     </w:p>
     <w:p>
@@ -680,7 +680,7 @@
           <w:rFonts w:ascii="Calibri" w:eastAsia="Times New Roman" w:hAnsi="Calibri" w:cs="Calibri"/>
           <w:lang w:val="es-ES"/>
         </w:rPr>
-        <w:t>2. Cómo nos organizamos (lámina de equipo)</w:t>
+        <w:t>2. Límite de mi rol</w:t>
       </w:r>
     </w:p>
     <w:tbl>
@@ -775,7 +775,7 @@
                 <w:sz w:val="20"/>
                 <w:szCs w:val="20"/>
               </w:rPr>
-              <w:t>Rol en la propuesta</w:t>
+              <w:t>Rol</w:t>
             </w:r>
           </w:p>
         </w:tc>
@@ -813,7 +813,7 @@
                 <w:sz w:val="20"/>
                 <w:szCs w:val="20"/>
               </w:rPr>
-              <w:t>Qué cubre</w:t>
+              <w:t>En estas semanas</w:t>
             </w:r>
           </w:p>
         </w:tc>
@@ -932,7 +932,7 @@
                 <w:sz w:val="20"/>
                 <w:szCs w:val="20"/>
               </w:rPr>
-              <w:t>Visión del producto, priorización y coordinación del equipo.</w:t>
+              <w:t>Intención del producto, recortes (WhatsApp, admin fuera, relato), sprints, PPT.</w:t>
             </w:r>
           </w:p>
         </w:tc>
@@ -1048,11 +1048,42 @@
             <w:r>
               <w:rPr>
                 <w:rFonts w:ascii="Calibri" w:eastAsia="Times New Roman" w:hAnsi="Calibri" w:cs="Calibri"/>
-                <w:color w:val="222222"/>
-                <w:sz w:val="20"/>
-                <w:szCs w:val="20"/>
-              </w:rPr>
-              <w:t>Diseño técnico, backend, frontend y app de escritorio.</w:t>
+                <w:i/>
+                <w:iCs/>
+                <w:color w:val="222222"/>
+                <w:sz w:val="20"/>
+                <w:szCs w:val="20"/>
+              </w:rPr>
+              <w:t>web/</w:t>
+            </w:r>
+            <w:r>
+              <w:rPr>
+                <w:rFonts w:ascii="Calibri" w:eastAsia="Times New Roman" w:hAnsi="Calibri" w:cs="Calibri"/>
+                <w:color w:val="222222"/>
+                <w:sz w:val="20"/>
+                <w:szCs w:val="20"/>
+              </w:rPr>
+              <w:t xml:space="preserve"> y </w:t>
+            </w:r>
+            <w:r>
+              <w:rPr>
+                <w:rFonts w:ascii="Calibri" w:eastAsia="Times New Roman" w:hAnsi="Calibri" w:cs="Calibri"/>
+                <w:i/>
+                <w:iCs/>
+                <w:color w:val="222222"/>
+                <w:sz w:val="20"/>
+                <w:szCs w:val="20"/>
+              </w:rPr>
+              <w:t>desktop/</w:t>
+            </w:r>
+            <w:r>
+              <w:rPr>
+                <w:rFonts w:ascii="Calibri" w:eastAsia="Times New Roman" w:hAnsi="Calibri" w:cs="Calibri"/>
+                <w:color w:val="222222"/>
+                <w:sz w:val="20"/>
+                <w:szCs w:val="20"/>
+              </w:rPr>
+              <w:t>, backend, tres puertas, 2FA, modelo de datos, entorno técnico.</w:t>
             </w:r>
           </w:p>
         </w:tc>
@@ -1171,245 +1202,7 @@
                 <w:sz w:val="20"/>
                 <w:szCs w:val="20"/>
               </w:rPr>
-              <w:t>Pagos, pedidos en línea y operación del local.</w:t>
-            </w:r>
-          </w:p>
-        </w:tc>
-      </w:tr>
-      <w:tr>
-        <w:trPr>
-          <w:cantSplit/>
-        </w:trPr>
-        <w:tc>
-          <w:tcPr>
-            <w:tcW w:w="0" w:type="auto"/>
-            <w:tcBorders>
-              <w:top w:val="single" w:sz="6" w:space="0" w:color="8FAADC"/>
-              <w:left w:val="single" w:sz="6" w:space="0" w:color="8FAADC"/>
-              <w:bottom w:val="single" w:sz="6" w:space="0" w:color="8FAADC"/>
-              <w:right w:val="single" w:sz="6" w:space="0" w:color="8FAADC"/>
-            </w:tcBorders>
-            <w:tcMar>
-              <w:top w:w="100" w:type="dxa"/>
-              <w:left w:w="120" w:type="dxa"/>
-              <w:bottom w:w="100" w:type="dxa"/>
-              <w:right w:w="120" w:type="dxa"/>
-            </w:tcMar>
-            <w:hideMark/>
-          </w:tcPr>
-          <w:p>
-            <w:pPr>
-              <w:spacing w:before="160" w:after="240"/>
-              <w:rPr>
-                <w:rFonts w:ascii="Calibri" w:eastAsia="Times New Roman" w:hAnsi="Calibri" w:cs="Calibri"/>
-                <w:color w:val="222222"/>
-                <w:sz w:val="20"/>
-                <w:szCs w:val="20"/>
-              </w:rPr>
-            </w:pPr>
-            <w:r>
-              <w:rPr>
-                <w:rFonts w:ascii="Calibri" w:eastAsia="Times New Roman" w:hAnsi="Calibri" w:cs="Calibri"/>
-                <w:color w:val="222222"/>
-                <w:sz w:val="20"/>
-                <w:szCs w:val="20"/>
-              </w:rPr>
-              <w:t>Mitzi (no es integrante)</w:t>
-            </w:r>
-          </w:p>
-        </w:tc>
-        <w:tc>
-          <w:tcPr>
-            <w:tcW w:w="0" w:type="auto"/>
-            <w:tcBorders>
-              <w:top w:val="single" w:sz="6" w:space="0" w:color="8FAADC"/>
-              <w:left w:val="single" w:sz="6" w:space="0" w:color="8FAADC"/>
-              <w:bottom w:val="single" w:sz="6" w:space="0" w:color="8FAADC"/>
-              <w:right w:val="single" w:sz="6" w:space="0" w:color="8FAADC"/>
-            </w:tcBorders>
-            <w:tcMar>
-              <w:top w:w="100" w:type="dxa"/>
-              <w:left w:w="120" w:type="dxa"/>
-              <w:bottom w:w="100" w:type="dxa"/>
-              <w:right w:w="120" w:type="dxa"/>
-            </w:tcMar>
-            <w:hideMark/>
-          </w:tcPr>
-          <w:p>
-            <w:pPr>
-              <w:spacing w:before="160" w:after="240"/>
-              <w:rPr>
-                <w:rFonts w:ascii="Calibri" w:eastAsia="Times New Roman" w:hAnsi="Calibri" w:cs="Calibri"/>
-                <w:color w:val="222222"/>
-                <w:sz w:val="20"/>
-                <w:szCs w:val="20"/>
-              </w:rPr>
-            </w:pPr>
-            <w:r>
-              <w:rPr>
-                <w:rFonts w:ascii="Calibri" w:eastAsia="Times New Roman" w:hAnsi="Calibri" w:cs="Calibri"/>
-                <w:color w:val="222222"/>
-                <w:sz w:val="20"/>
-                <w:szCs w:val="20"/>
-              </w:rPr>
-              <w:t>Dueña de La 200</w:t>
-            </w:r>
-          </w:p>
-        </w:tc>
-        <w:tc>
-          <w:tcPr>
-            <w:tcW w:w="0" w:type="auto"/>
-            <w:tcBorders>
-              <w:top w:val="single" w:sz="6" w:space="0" w:color="8FAADC"/>
-              <w:left w:val="single" w:sz="6" w:space="0" w:color="8FAADC"/>
-              <w:bottom w:val="single" w:sz="6" w:space="0" w:color="8FAADC"/>
-              <w:right w:val="single" w:sz="6" w:space="0" w:color="8FAADC"/>
-            </w:tcBorders>
-            <w:tcMar>
-              <w:top w:w="100" w:type="dxa"/>
-              <w:left w:w="120" w:type="dxa"/>
-              <w:bottom w:w="100" w:type="dxa"/>
-              <w:right w:w="120" w:type="dxa"/>
-            </w:tcMar>
-            <w:hideMark/>
-          </w:tcPr>
-          <w:p>
-            <w:pPr>
-              <w:spacing w:before="160" w:after="240"/>
-              <w:rPr>
-                <w:rFonts w:ascii="Calibri" w:eastAsia="Times New Roman" w:hAnsi="Calibri" w:cs="Calibri"/>
-                <w:color w:val="222222"/>
-                <w:sz w:val="20"/>
-                <w:szCs w:val="20"/>
-              </w:rPr>
-            </w:pPr>
-            <w:r>
-              <w:rPr>
-                <w:rFonts w:ascii="Calibri" w:eastAsia="Times New Roman" w:hAnsi="Calibri" w:cs="Calibri"/>
-                <w:color w:val="222222"/>
-                <w:sz w:val="20"/>
-                <w:szCs w:val="20"/>
-              </w:rPr>
-              <w:t>El sistema se construye para su local. Administra desde el escritorio.</w:t>
-            </w:r>
-          </w:p>
-        </w:tc>
-      </w:tr>
-      <w:tr>
-        <w:trPr>
-          <w:cantSplit/>
-        </w:trPr>
-        <w:tc>
-          <w:tcPr>
-            <w:tcW w:w="0" w:type="auto"/>
-            <w:tcBorders>
-              <w:top w:val="single" w:sz="6" w:space="0" w:color="8FAADC"/>
-              <w:left w:val="single" w:sz="6" w:space="0" w:color="8FAADC"/>
-              <w:bottom w:val="single" w:sz="6" w:space="0" w:color="8FAADC"/>
-              <w:right w:val="single" w:sz="6" w:space="0" w:color="8FAADC"/>
-            </w:tcBorders>
-            <w:tcMar>
-              <w:top w:w="100" w:type="dxa"/>
-              <w:left w:w="120" w:type="dxa"/>
-              <w:bottom w:w="100" w:type="dxa"/>
-              <w:right w:w="120" w:type="dxa"/>
-            </w:tcMar>
-            <w:hideMark/>
-          </w:tcPr>
-          <w:p>
-            <w:pPr>
-              <w:spacing w:before="160" w:after="240"/>
-              <w:rPr>
-                <w:rFonts w:ascii="Calibri" w:eastAsia="Times New Roman" w:hAnsi="Calibri" w:cs="Calibri"/>
-                <w:color w:val="222222"/>
-                <w:sz w:val="20"/>
-                <w:szCs w:val="20"/>
-              </w:rPr>
-            </w:pPr>
-            <w:r>
-              <w:rPr>
-                <w:rFonts w:ascii="Calibri" w:eastAsia="Times New Roman" w:hAnsi="Calibri" w:cs="Calibri"/>
-                <w:color w:val="222222"/>
-                <w:sz w:val="20"/>
-                <w:szCs w:val="20"/>
-              </w:rPr>
-              <w:t>Trabajadores mayores (no son integrantes)</w:t>
-            </w:r>
-          </w:p>
-        </w:tc>
-        <w:tc>
-          <w:tcPr>
-            <w:tcW w:w="0" w:type="auto"/>
-            <w:tcBorders>
-              <w:top w:val="single" w:sz="6" w:space="0" w:color="8FAADC"/>
-              <w:left w:val="single" w:sz="6" w:space="0" w:color="8FAADC"/>
-              <w:bottom w:val="single" w:sz="6" w:space="0" w:color="8FAADC"/>
-              <w:right w:val="single" w:sz="6" w:space="0" w:color="8FAADC"/>
-            </w:tcBorders>
-            <w:tcMar>
-              <w:top w:w="100" w:type="dxa"/>
-              <w:left w:w="120" w:type="dxa"/>
-              <w:bottom w:w="100" w:type="dxa"/>
-              <w:right w:w="120" w:type="dxa"/>
-            </w:tcMar>
-            <w:hideMark/>
-          </w:tcPr>
-          <w:p>
-            <w:pPr>
-              <w:spacing w:before="160" w:after="240"/>
-              <w:rPr>
-                <w:rFonts w:ascii="Calibri" w:eastAsia="Times New Roman" w:hAnsi="Calibri" w:cs="Calibri"/>
-                <w:color w:val="222222"/>
-                <w:sz w:val="20"/>
-                <w:szCs w:val="20"/>
-              </w:rPr>
-            </w:pPr>
-            <w:r>
-              <w:rPr>
-                <w:rFonts w:ascii="Calibri" w:eastAsia="Times New Roman" w:hAnsi="Calibri" w:cs="Calibri"/>
-                <w:color w:val="222222"/>
-                <w:sz w:val="20"/>
-                <w:szCs w:val="20"/>
-              </w:rPr>
-              <w:t>Usuario principal del POS</w:t>
-            </w:r>
-          </w:p>
-        </w:tc>
-        <w:tc>
-          <w:tcPr>
-            <w:tcW w:w="0" w:type="auto"/>
-            <w:tcBorders>
-              <w:top w:val="single" w:sz="6" w:space="0" w:color="8FAADC"/>
-              <w:left w:val="single" w:sz="6" w:space="0" w:color="8FAADC"/>
-              <w:bottom w:val="single" w:sz="6" w:space="0" w:color="8FAADC"/>
-              <w:right w:val="single" w:sz="6" w:space="0" w:color="8FAADC"/>
-            </w:tcBorders>
-            <w:tcMar>
-              <w:top w:w="100" w:type="dxa"/>
-              <w:left w:w="120" w:type="dxa"/>
-              <w:bottom w:w="100" w:type="dxa"/>
-              <w:right w:w="120" w:type="dxa"/>
-            </w:tcMar>
-            <w:hideMark/>
-          </w:tcPr>
-          <w:p>
-            <w:pPr>
-              <w:spacing w:before="160" w:after="240"/>
-              <w:rPr>
-                <w:rFonts w:ascii="Calibri" w:eastAsia="Times New Roman" w:hAnsi="Calibri" w:cs="Calibri"/>
-                <w:color w:val="222222"/>
-                <w:sz w:val="20"/>
-                <w:szCs w:val="20"/>
-              </w:rPr>
-            </w:pPr>
-            <w:r>
-              <w:rPr>
-                <w:rFonts w:ascii="Calibri" w:eastAsia="Times New Roman" w:hAnsi="Calibri" w:cs="Calibri"/>
-                <w:color w:val="222222"/>
-                <w:sz w:val="20"/>
-                <w:szCs w:val="20"/>
-              </w:rPr>
-              <w:t>Adultos mayores que operan el local día a día.</w:t>
+              <w:t>Flujo de cobro y entrega, pendientes vs entregados, diseño de TUU/Webpay/efectivo.</w:t>
             </w:r>
           </w:p>
         </w:tc>
@@ -1417,7 +1210,41 @@
     </w:tbl>
     <w:p>
       <w:pPr>
+        <w:pStyle w:val="Heading2"/>
+        <w:rPr>
+          <w:rFonts w:ascii="Calibri" w:eastAsia="Times New Roman" w:hAnsi="Calibri" w:cs="Calibri"/>
+          <w:lang w:val="es-ES"/>
+        </w:rPr>
+      </w:pPr>
+      <w:r>
+        <w:rPr>
+          <w:rFonts w:ascii="Calibri" w:eastAsia="Times New Roman" w:hAnsi="Calibri" w:cs="Calibri"/>
+          <w:lang w:val="es-ES"/>
+        </w:rPr>
+        <w:t>3. Entradas</w:t>
+      </w:r>
+    </w:p>
+    <w:p>
+      <w:pPr>
+        <w:pStyle w:val="Heading3"/>
+        <w:divId w:val="2064525233"/>
+        <w:rPr>
+          <w:rFonts w:ascii="Calibri" w:eastAsia="Times New Roman" w:hAnsi="Calibri" w:cs="Calibri"/>
+          <w:lang w:val="es-ES"/>
+        </w:rPr>
+      </w:pPr>
+      <w:r>
+        <w:rPr>
+          <w:rFonts w:ascii="Calibri" w:eastAsia="Times New Roman" w:hAnsi="Calibri" w:cs="Calibri"/>
+          <w:lang w:val="es-ES"/>
+        </w:rPr>
+        <w:t>Entrada 1 — 15 de agosto de 2026</w:t>
+      </w:r>
+    </w:p>
+    <w:p>
+      <w:pPr>
         <w:pStyle w:val="NormalWeb"/>
+        <w:divId w:val="2064525233"/>
         <w:rPr>
           <w:rFonts w:ascii="Calibri" w:hAnsi="Calibri" w:cs="Calibri"/>
           <w:color w:val="222222"/>
@@ -1428,13 +1255,608 @@
       </w:pPr>
       <w:r>
         <w:rPr>
-          <w:rFonts w:ascii="Calibri" w:hAnsi="Calibri" w:cs="Calibri"/>
-          <w:color w:val="222222"/>
-          <w:sz w:val="22"/>
-          <w:szCs w:val="22"/>
-          <w:lang w:val="es-ES"/>
-        </w:rPr>
-        <w:t>Escribo en primera persona porque la reflexión es individual. Cuando digo “nosotros”, es el equipo de título. Cuando digo “el local”, son Mitzi y quienes atienden.</w:t>
+          <w:rStyle w:val="label1"/>
+          <w:rFonts w:ascii="Calibri" w:hAnsi="Calibri" w:cs="Calibri"/>
+          <w:sz w:val="22"/>
+          <w:szCs w:val="22"/>
+          <w:lang w:val="es-ES"/>
+        </w:rPr>
+        <w:t>Qué ocurrió, en mi parte.</w:t>
+      </w:r>
+      <w:r>
+        <w:rPr>
+          <w:rFonts w:ascii="Calibri" w:hAnsi="Calibri" w:cs="Calibri"/>
+          <w:color w:val="222222"/>
+          <w:sz w:val="22"/>
+          <w:szCs w:val="22"/>
+          <w:lang w:val="es-ES"/>
+        </w:rPr>
+        <w:t xml:space="preserve"> Había prototipo. Joaquín empujó a tratarlo como Proyecto APT con roles. Yo empecé a dejar de pensar “la app” y a pensar dos bases técnicas: web y escritorio.</w:t>
+      </w:r>
+    </w:p>
+    <w:p>
+      <w:pPr>
+        <w:pStyle w:val="NormalWeb"/>
+        <w:divId w:val="2064525233"/>
+        <w:rPr>
+          <w:rFonts w:ascii="Calibri" w:hAnsi="Calibri" w:cs="Calibri"/>
+          <w:color w:val="222222"/>
+          <w:sz w:val="22"/>
+          <w:szCs w:val="22"/>
+          <w:lang w:val="es-ES"/>
+        </w:rPr>
+      </w:pPr>
+      <w:r>
+        <w:rPr>
+          <w:rStyle w:val="label1"/>
+          <w:rFonts w:ascii="Calibri" w:hAnsi="Calibri" w:cs="Calibri"/>
+          <w:sz w:val="22"/>
+          <w:szCs w:val="22"/>
+          <w:lang w:val="es-ES"/>
+        </w:rPr>
+        <w:t>Qué no me tocó.</w:t>
+      </w:r>
+      <w:r>
+        <w:rPr>
+          <w:rFonts w:ascii="Calibri" w:hAnsi="Calibri" w:cs="Calibri"/>
+          <w:color w:val="222222"/>
+          <w:sz w:val="22"/>
+          <w:szCs w:val="22"/>
+          <w:lang w:val="es-ES"/>
+        </w:rPr>
+        <w:t xml:space="preserve"> Decidir que esto es título y no un ejercicio suelto: Joaquín. Definir cómo se cobra en el local: Benjamín.</w:t>
+      </w:r>
+    </w:p>
+    <w:p>
+      <w:pPr>
+        <w:pStyle w:val="NormalWeb"/>
+        <w:divId w:val="2064525233"/>
+        <w:rPr>
+          <w:rFonts w:ascii="Calibri" w:hAnsi="Calibri" w:cs="Calibri"/>
+          <w:color w:val="222222"/>
+          <w:sz w:val="22"/>
+          <w:szCs w:val="22"/>
+          <w:lang w:val="es-ES"/>
+        </w:rPr>
+      </w:pPr>
+      <w:r>
+        <w:rPr>
+          <w:rStyle w:val="label1"/>
+          <w:rFonts w:ascii="Calibri" w:hAnsi="Calibri" w:cs="Calibri"/>
+          <w:sz w:val="22"/>
+          <w:szCs w:val="22"/>
+          <w:lang w:val="es-ES"/>
+        </w:rPr>
+        <w:t>Qué hice.</w:t>
+      </w:r>
+      <w:r>
+        <w:rPr>
+          <w:rFonts w:ascii="Calibri" w:hAnsi="Calibri" w:cs="Calibri"/>
+          <w:color w:val="222222"/>
+          <w:sz w:val="22"/>
+          <w:szCs w:val="22"/>
+          <w:lang w:val="es-ES"/>
+        </w:rPr>
+        <w:t xml:space="preserve"> Separar mentalmente (y después en carpetas) lo que va a ser </w:t>
+      </w:r>
+      <w:r>
+        <w:rPr>
+          <w:rFonts w:ascii="Calibri" w:hAnsi="Calibri" w:cs="Calibri"/>
+          <w:i/>
+          <w:iCs/>
+          <w:color w:val="222222"/>
+          <w:sz w:val="22"/>
+          <w:szCs w:val="22"/>
+          <w:lang w:val="es-ES"/>
+        </w:rPr>
+        <w:t>web/</w:t>
+      </w:r>
+      <w:r>
+        <w:rPr>
+          <w:rFonts w:ascii="Calibri" w:hAnsi="Calibri" w:cs="Calibri"/>
+          <w:color w:val="222222"/>
+          <w:sz w:val="22"/>
+          <w:szCs w:val="22"/>
+          <w:lang w:val="es-ES"/>
+        </w:rPr>
+        <w:t xml:space="preserve"> y </w:t>
+      </w:r>
+      <w:r>
+        <w:rPr>
+          <w:rFonts w:ascii="Calibri" w:hAnsi="Calibri" w:cs="Calibri"/>
+          <w:i/>
+          <w:iCs/>
+          <w:color w:val="222222"/>
+          <w:sz w:val="22"/>
+          <w:szCs w:val="22"/>
+          <w:lang w:val="es-ES"/>
+        </w:rPr>
+        <w:t>desktop/</w:t>
+      </w:r>
+      <w:r>
+        <w:rPr>
+          <w:rFonts w:ascii="Calibri" w:hAnsi="Calibri" w:cs="Calibri"/>
+          <w:color w:val="222222"/>
+          <w:sz w:val="22"/>
+          <w:szCs w:val="22"/>
+          <w:lang w:val="es-ES"/>
+        </w:rPr>
+        <w:t>. Levantar el entorno en red local para que el equipo pudiera ver el sistema, no para “demostrar el producto”: la demostración de producto la coordina Joaquín.</w:t>
+      </w:r>
+    </w:p>
+    <w:p>
+      <w:pPr>
+        <w:pStyle w:val="NormalWeb"/>
+        <w:divId w:val="2064525233"/>
+        <w:rPr>
+          <w:rFonts w:ascii="Calibri" w:hAnsi="Calibri" w:cs="Calibri"/>
+          <w:color w:val="222222"/>
+          <w:sz w:val="22"/>
+          <w:szCs w:val="22"/>
+          <w:lang w:val="es-ES"/>
+        </w:rPr>
+      </w:pPr>
+      <w:r>
+        <w:rPr>
+          <w:rStyle w:val="label1"/>
+          <w:rFonts w:ascii="Calibri" w:hAnsi="Calibri" w:cs="Calibri"/>
+          <w:sz w:val="22"/>
+          <w:szCs w:val="22"/>
+          <w:lang w:val="es-ES"/>
+        </w:rPr>
+        <w:t>Aprendí.</w:t>
+      </w:r>
+      <w:r>
+        <w:rPr>
+          <w:rFonts w:ascii="Calibri" w:hAnsi="Calibri" w:cs="Calibri"/>
+          <w:color w:val="222222"/>
+          <w:sz w:val="22"/>
+          <w:szCs w:val="22"/>
+          <w:lang w:val="es-ES"/>
+        </w:rPr>
+        <w:t xml:space="preserve"> Si no corto el sistema ahora, después voy a absorber el trabajo de los otros dos sin querer.</w:t>
+      </w:r>
+    </w:p>
+    <w:p>
+      <w:pPr>
+        <w:pStyle w:val="Heading3"/>
+        <w:divId w:val="1009020334"/>
+        <w:rPr>
+          <w:rFonts w:ascii="Calibri" w:eastAsia="Times New Roman" w:hAnsi="Calibri" w:cs="Calibri"/>
+          <w:lang w:val="es-ES"/>
+        </w:rPr>
+      </w:pPr>
+      <w:r>
+        <w:rPr>
+          <w:rFonts w:ascii="Calibri" w:eastAsia="Times New Roman" w:hAnsi="Calibri" w:cs="Calibri"/>
+          <w:lang w:val="es-ES"/>
+        </w:rPr>
+        <w:t>Entrada 2 — 18 de agosto de 2026</w:t>
+      </w:r>
+    </w:p>
+    <w:p>
+      <w:pPr>
+        <w:pStyle w:val="NormalWeb"/>
+        <w:divId w:val="1009020334"/>
+        <w:rPr>
+          <w:rFonts w:ascii="Calibri" w:hAnsi="Calibri" w:cs="Calibri"/>
+          <w:color w:val="222222"/>
+          <w:sz w:val="22"/>
+          <w:szCs w:val="22"/>
+          <w:lang w:val="es-ES"/>
+        </w:rPr>
+      </w:pPr>
+      <w:r>
+        <w:rPr>
+          <w:rStyle w:val="label1"/>
+          <w:rFonts w:ascii="Calibri" w:hAnsi="Calibri" w:cs="Calibri"/>
+          <w:sz w:val="22"/>
+          <w:szCs w:val="22"/>
+          <w:lang w:val="es-ES"/>
+        </w:rPr>
+        <w:t>Qué ocurrió, en mi parte.</w:t>
+      </w:r>
+      <w:r>
+        <w:rPr>
+          <w:rFonts w:ascii="Calibri" w:hAnsi="Calibri" w:cs="Calibri"/>
+          <w:color w:val="222222"/>
+          <w:sz w:val="22"/>
+          <w:szCs w:val="22"/>
+          <w:lang w:val="es-ES"/>
+        </w:rPr>
+        <w:t xml:space="preserve"> </w:t>
+      </w:r>
+      <w:r>
+        <w:rPr>
+          <w:rFonts w:ascii="Calibri" w:hAnsi="Calibri" w:cs="Calibri"/>
+          <w:color w:val="222222"/>
+          <w:sz w:val="22"/>
+          <w:szCs w:val="22"/>
+          <w:lang w:val="es-ES"/>
+        </w:rPr>
+        <w:t>Joaquín cerró tres reglas de producto: admin fuera de la tablet, Authenticator para Mitzi, retiro sin WhatsApp. Yo las traduje a diseño técnico: Electron + TOTP, modelo con nombre y teléfono, el admin no se sirve por la web del local.</w:t>
+      </w:r>
+    </w:p>
+    <w:p>
+      <w:pPr>
+        <w:pStyle w:val="NormalWeb"/>
+        <w:divId w:val="1009020334"/>
+        <w:rPr>
+          <w:rFonts w:ascii="Calibri" w:hAnsi="Calibri" w:cs="Calibri"/>
+          <w:color w:val="222222"/>
+          <w:sz w:val="22"/>
+          <w:szCs w:val="22"/>
+          <w:lang w:val="es-ES"/>
+        </w:rPr>
+      </w:pPr>
+      <w:r>
+        <w:rPr>
+          <w:rStyle w:val="label1"/>
+          <w:rFonts w:ascii="Calibri" w:hAnsi="Calibri" w:cs="Calibri"/>
+          <w:sz w:val="22"/>
+          <w:szCs w:val="22"/>
+          <w:lang w:val="es-ES"/>
+        </w:rPr>
+        <w:t>Qué no me tocó.</w:t>
+      </w:r>
+      <w:r>
+        <w:rPr>
+          <w:rFonts w:ascii="Calibri" w:hAnsi="Calibri" w:cs="Calibri"/>
+          <w:color w:val="222222"/>
+          <w:sz w:val="22"/>
+          <w:szCs w:val="22"/>
+          <w:lang w:val="es-ES"/>
+        </w:rPr>
+        <w:t xml:space="preserve"> Descartar WhatsApp como canal de negocio: Joaquín. Usar nombre y teléfono en el mostrador al entregar: Benjamín. Yo solo persisto esos campos y dejo de construir un bot de WhatsApp.</w:t>
+      </w:r>
+    </w:p>
+    <w:p>
+      <w:pPr>
+        <w:pStyle w:val="NormalWeb"/>
+        <w:divId w:val="1009020334"/>
+        <w:rPr>
+          <w:rFonts w:ascii="Calibri" w:hAnsi="Calibri" w:cs="Calibri"/>
+          <w:color w:val="222222"/>
+          <w:sz w:val="22"/>
+          <w:szCs w:val="22"/>
+          <w:lang w:val="es-ES"/>
+        </w:rPr>
+      </w:pPr>
+      <w:r>
+        <w:rPr>
+          <w:rStyle w:val="label1"/>
+          <w:rFonts w:ascii="Calibri" w:hAnsi="Calibri" w:cs="Calibri"/>
+          <w:sz w:val="22"/>
+          <w:szCs w:val="22"/>
+          <w:lang w:val="es-ES"/>
+        </w:rPr>
+        <w:t>Dificultad mía.</w:t>
+      </w:r>
+      <w:r>
+        <w:rPr>
+          <w:rFonts w:ascii="Calibri" w:hAnsi="Calibri" w:cs="Calibri"/>
+          <w:color w:val="222222"/>
+          <w:sz w:val="22"/>
+          <w:szCs w:val="22"/>
+          <w:lang w:val="es-ES"/>
+        </w:rPr>
+        <w:t xml:space="preserve"> </w:t>
+      </w:r>
+      <w:r>
+        <w:rPr>
+          <w:rFonts w:ascii="Calibri" w:hAnsi="Calibri" w:cs="Calibri"/>
+          <w:color w:val="222222"/>
+          <w:sz w:val="22"/>
+          <w:szCs w:val="22"/>
+          <w:lang w:val="es-ES"/>
+        </w:rPr>
+        <w:t>El escritorio con TOTP es más trabajo, y cae en mi rol. No es un recorte de alcance de Benjamín ni una idea que yo haya priorizado: Joaquín pidió la separación; yo estimé e implementé el camino técnico.</w:t>
+      </w:r>
+    </w:p>
+    <w:p>
+      <w:pPr>
+        <w:pStyle w:val="NormalWeb"/>
+        <w:divId w:val="1009020334"/>
+        <w:rPr>
+          <w:rFonts w:ascii="Calibri" w:hAnsi="Calibri" w:cs="Calibri"/>
+          <w:color w:val="222222"/>
+          <w:sz w:val="22"/>
+          <w:szCs w:val="22"/>
+          <w:lang w:val="es-ES"/>
+        </w:rPr>
+      </w:pPr>
+      <w:r>
+        <w:rPr>
+          <w:rStyle w:val="label1"/>
+          <w:rFonts w:ascii="Calibri" w:hAnsi="Calibri" w:cs="Calibri"/>
+          <w:sz w:val="22"/>
+          <w:szCs w:val="22"/>
+          <w:lang w:val="es-ES"/>
+        </w:rPr>
+        <w:t>Aprendí.</w:t>
+      </w:r>
+      <w:r>
+        <w:rPr>
+          <w:rFonts w:ascii="Calibri" w:hAnsi="Calibri" w:cs="Calibri"/>
+          <w:color w:val="222222"/>
+          <w:sz w:val="22"/>
+          <w:szCs w:val="22"/>
+          <w:lang w:val="es-ES"/>
+        </w:rPr>
+        <w:t xml:space="preserve"> Arquitectura es decidir qué no va en cada aplicación. Cobrar y pedir no se diseñan en la misma pantalla que el Authenticator.</w:t>
+      </w:r>
+    </w:p>
+    <w:p>
+      <w:pPr>
+        <w:pStyle w:val="Heading3"/>
+        <w:divId w:val="1346059373"/>
+        <w:rPr>
+          <w:rFonts w:ascii="Calibri" w:eastAsia="Times New Roman" w:hAnsi="Calibri" w:cs="Calibri"/>
+          <w:lang w:val="es-ES"/>
+        </w:rPr>
+      </w:pPr>
+      <w:r>
+        <w:rPr>
+          <w:rFonts w:ascii="Calibri" w:eastAsia="Times New Roman" w:hAnsi="Calibri" w:cs="Calibri"/>
+          <w:lang w:val="es-ES"/>
+        </w:rPr>
+        <w:t>Entrada 3 — 21 y 22 de agosto de 2026</w:t>
+      </w:r>
+    </w:p>
+    <w:p>
+      <w:pPr>
+        <w:pStyle w:val="NormalWeb"/>
+        <w:divId w:val="1346059373"/>
+        <w:rPr>
+          <w:rFonts w:ascii="Calibri" w:hAnsi="Calibri" w:cs="Calibri"/>
+          <w:color w:val="222222"/>
+          <w:sz w:val="22"/>
+          <w:szCs w:val="22"/>
+          <w:lang w:val="es-ES"/>
+        </w:rPr>
+      </w:pPr>
+      <w:r>
+        <w:rPr>
+          <w:rStyle w:val="label1"/>
+          <w:rFonts w:ascii="Calibri" w:hAnsi="Calibri" w:cs="Calibri"/>
+          <w:sz w:val="22"/>
+          <w:szCs w:val="22"/>
+          <w:lang w:val="es-ES"/>
+        </w:rPr>
+        <w:t>Qué ocurrió, en mi parte.</w:t>
+      </w:r>
+      <w:r>
+        <w:rPr>
+          <w:rFonts w:ascii="Calibri" w:hAnsi="Calibri" w:cs="Calibri"/>
+          <w:color w:val="222222"/>
+          <w:sz w:val="22"/>
+          <w:szCs w:val="22"/>
+          <w:lang w:val="es-ES"/>
+        </w:rPr>
+        <w:t xml:space="preserve"> </w:t>
+      </w:r>
+      <w:r>
+        <w:rPr>
+          <w:rFonts w:ascii="Calibri" w:hAnsi="Calibri" w:cs="Calibri"/>
+          <w:color w:val="222222"/>
+          <w:sz w:val="22"/>
+          <w:szCs w:val="22"/>
+          <w:lang w:val="es-ES"/>
+        </w:rPr>
+        <w:t>Dejé usuarios técnicos (tres del equipo, Mitzi admin, un vendedor) y sostuve el entorno (web, escritorio, hotspot) para probar. Ajusté componentes de frontend cuando el equipo lo pidió: filtros de catálogo, estructura de listados.</w:t>
+      </w:r>
+    </w:p>
+    <w:p>
+      <w:pPr>
+        <w:pStyle w:val="NormalWeb"/>
+        <w:divId w:val="1346059373"/>
+        <w:rPr>
+          <w:rFonts w:ascii="Calibri" w:hAnsi="Calibri" w:cs="Calibri"/>
+          <w:color w:val="222222"/>
+          <w:sz w:val="22"/>
+          <w:szCs w:val="22"/>
+          <w:lang w:val="es-ES"/>
+        </w:rPr>
+      </w:pPr>
+      <w:r>
+        <w:rPr>
+          <w:rStyle w:val="label1"/>
+          <w:rFonts w:ascii="Calibri" w:hAnsi="Calibri" w:cs="Calibri"/>
+          <w:sz w:val="22"/>
+          <w:szCs w:val="22"/>
+          <w:lang w:val="es-ES"/>
+        </w:rPr>
+        <w:t>Qué no me tocó.</w:t>
+      </w:r>
+      <w:r>
+        <w:rPr>
+          <w:rFonts w:ascii="Calibri" w:hAnsi="Calibri" w:cs="Calibri"/>
+          <w:color w:val="222222"/>
+          <w:sz w:val="22"/>
+          <w:szCs w:val="22"/>
+          <w:lang w:val="es-ES"/>
+        </w:rPr>
+        <w:t xml:space="preserve"> </w:t>
+      </w:r>
+      <w:r>
+        <w:rPr>
+          <w:rFonts w:ascii="Calibri" w:hAnsi="Calibri" w:cs="Calibri"/>
+          <w:color w:val="222222"/>
+          <w:sz w:val="22"/>
+          <w:szCs w:val="22"/>
+          <w:lang w:val="es-ES"/>
+        </w:rPr>
+        <w:t xml:space="preserve">Pedir más tarjetas por fila y separar pendientes de entregados como regla de operación: eso es el mostrador, de Benjamín, priorizado por Joaquín. Yo moví la UI; no soy el dueño de ese flujo. </w:t>
+      </w:r>
+      <w:r>
+        <w:rPr>
+          <w:rFonts w:ascii="Calibri" w:hAnsi="Calibri" w:cs="Calibri"/>
+          <w:color w:val="222222"/>
+          <w:sz w:val="22"/>
+          <w:szCs w:val="22"/>
+          <w:lang w:val="es-ES"/>
+        </w:rPr>
+        <w:lastRenderedPageBreak/>
+        <w:t>Probar “si el trabajador entiende al primer toque” es criterio de producto de Joaquín y de operación de Benjamín, no un logro de arquitectura.</w:t>
+      </w:r>
+    </w:p>
+    <w:p>
+      <w:pPr>
+        <w:pStyle w:val="NormalWeb"/>
+        <w:divId w:val="1346059373"/>
+        <w:rPr>
+          <w:rFonts w:ascii="Calibri" w:hAnsi="Calibri" w:cs="Calibri"/>
+          <w:color w:val="222222"/>
+          <w:sz w:val="22"/>
+          <w:szCs w:val="22"/>
+          <w:lang w:val="es-ES"/>
+        </w:rPr>
+      </w:pPr>
+      <w:r>
+        <w:rPr>
+          <w:rStyle w:val="label1"/>
+          <w:rFonts w:ascii="Calibri" w:hAnsi="Calibri" w:cs="Calibri"/>
+          <w:sz w:val="22"/>
+          <w:szCs w:val="22"/>
+          <w:lang w:val="es-ES"/>
+        </w:rPr>
+        <w:t>Aprendí.</w:t>
+      </w:r>
+      <w:r>
+        <w:rPr>
+          <w:rFonts w:ascii="Calibri" w:hAnsi="Calibri" w:cs="Calibri"/>
+          <w:color w:val="222222"/>
+          <w:sz w:val="22"/>
+          <w:szCs w:val="22"/>
+          <w:lang w:val="es-ES"/>
+        </w:rPr>
+        <w:t xml:space="preserve"> Si implemento un listado, tengo que anotarlo como apoyo a la operación de Benjamín, no como “yo organicé el POS”.</w:t>
+      </w:r>
+    </w:p>
+    <w:p>
+      <w:pPr>
+        <w:pStyle w:val="Heading3"/>
+        <w:divId w:val="1095400847"/>
+        <w:rPr>
+          <w:rFonts w:ascii="Calibri" w:eastAsia="Times New Roman" w:hAnsi="Calibri" w:cs="Calibri"/>
+          <w:lang w:val="es-ES"/>
+        </w:rPr>
+      </w:pPr>
+      <w:r>
+        <w:rPr>
+          <w:rFonts w:ascii="Calibri" w:eastAsia="Times New Roman" w:hAnsi="Calibri" w:cs="Calibri"/>
+          <w:lang w:val="es-ES"/>
+        </w:rPr>
+        <w:t>Entrada 4 — 27 y 28 de agosto de 2026</w:t>
+      </w:r>
+    </w:p>
+    <w:p>
+      <w:pPr>
+        <w:pStyle w:val="NormalWeb"/>
+        <w:divId w:val="1095400847"/>
+        <w:rPr>
+          <w:rFonts w:ascii="Calibri" w:hAnsi="Calibri" w:cs="Calibri"/>
+          <w:color w:val="222222"/>
+          <w:sz w:val="22"/>
+          <w:szCs w:val="22"/>
+          <w:lang w:val="es-ES"/>
+        </w:rPr>
+      </w:pPr>
+      <w:r>
+        <w:rPr>
+          <w:rStyle w:val="label1"/>
+          <w:rFonts w:ascii="Calibri" w:hAnsi="Calibri" w:cs="Calibri"/>
+          <w:sz w:val="22"/>
+          <w:szCs w:val="22"/>
+          <w:lang w:val="es-ES"/>
+        </w:rPr>
+        <w:t>Qué ocurrió, en mi parte.</w:t>
+      </w:r>
+      <w:r>
+        <w:rPr>
+          <w:rFonts w:ascii="Calibri" w:hAnsi="Calibri" w:cs="Calibri"/>
+          <w:color w:val="222222"/>
+          <w:sz w:val="22"/>
+          <w:szCs w:val="22"/>
+          <w:lang w:val="es-ES"/>
+        </w:rPr>
+        <w:t xml:space="preserve"> Aporté a la propuesta la lámina técnica: tres puertas, escritorio, Authenticator, stack. Joaquín cerró el relato (parcelación, limpieza, Mitzi no integrante, sin fotos). Benjamín quedó escrito en pagos, pedidos y operación.</w:t>
+      </w:r>
+    </w:p>
+    <w:p>
+      <w:pPr>
+        <w:pStyle w:val="NormalWeb"/>
+        <w:divId w:val="1095400847"/>
+        <w:rPr>
+          <w:rFonts w:ascii="Calibri" w:hAnsi="Calibri" w:cs="Calibri"/>
+          <w:color w:val="222222"/>
+          <w:sz w:val="22"/>
+          <w:szCs w:val="22"/>
+          <w:lang w:val="es-ES"/>
+        </w:rPr>
+      </w:pPr>
+      <w:r>
+        <w:rPr>
+          <w:rStyle w:val="label1"/>
+          <w:rFonts w:ascii="Calibri" w:hAnsi="Calibri" w:cs="Calibri"/>
+          <w:sz w:val="22"/>
+          <w:szCs w:val="22"/>
+          <w:lang w:val="es-ES"/>
+        </w:rPr>
+        <w:t>Qué pensé.</w:t>
+      </w:r>
+      <w:r>
+        <w:rPr>
+          <w:rFonts w:ascii="Calibri" w:hAnsi="Calibri" w:cs="Calibri"/>
+          <w:color w:val="222222"/>
+          <w:sz w:val="22"/>
+          <w:szCs w:val="22"/>
+          <w:lang w:val="es-ES"/>
+        </w:rPr>
+        <w:t xml:space="preserve"> En un borrador anterior yo escribía como si el proyecto entero fuera mío. Eso le quita evidencias a Joaquín y a Benjamín, y la pauta de equidad lo castiga. Esta versión del diario existe para corregirlo.</w:t>
+      </w:r>
+    </w:p>
+    <w:p>
+      <w:pPr>
+        <w:pStyle w:val="NormalWeb"/>
+        <w:divId w:val="1095400847"/>
+        <w:rPr>
+          <w:rFonts w:ascii="Calibri" w:hAnsi="Calibri" w:cs="Calibri"/>
+          <w:color w:val="222222"/>
+          <w:sz w:val="22"/>
+          <w:szCs w:val="22"/>
+          <w:lang w:val="es-ES"/>
+        </w:rPr>
+      </w:pPr>
+      <w:r>
+        <w:rPr>
+          <w:rStyle w:val="label1"/>
+          <w:rFonts w:ascii="Calibri" w:hAnsi="Calibri" w:cs="Calibri"/>
+          <w:sz w:val="22"/>
+          <w:szCs w:val="22"/>
+          <w:lang w:val="es-ES"/>
+        </w:rPr>
+        <w:t>Aprendí.</w:t>
+      </w:r>
+      <w:r>
+        <w:rPr>
+          <w:rFonts w:ascii="Calibri" w:hAnsi="Calibri" w:cs="Calibri"/>
+          <w:color w:val="222222"/>
+          <w:sz w:val="22"/>
+          <w:szCs w:val="22"/>
+          <w:lang w:val="es-ES"/>
+        </w:rPr>
+        <w:t xml:space="preserve"> </w:t>
+      </w:r>
+      <w:r>
+        <w:rPr>
+          <w:rFonts w:ascii="Calibri" w:hAnsi="Calibri" w:cs="Calibri"/>
+          <w:color w:val="222222"/>
+          <w:sz w:val="22"/>
+          <w:szCs w:val="22"/>
+          <w:lang w:val="es-ES"/>
+        </w:rPr>
+        <w:t>Mi interés profesional cabe en una frase de la PPT: diseño técnico, backend, frontend y app de escritorio. Todo lo demás del equipo tiene que quedar fuera de mi autoevaluación.</w:t>
       </w:r>
     </w:p>
     <w:p>
@@ -1450,1017 +1872,7 @@
           <w:rFonts w:ascii="Calibri" w:eastAsia="Times New Roman" w:hAnsi="Calibri" w:cs="Calibri"/>
           <w:lang w:val="es-ES"/>
         </w:rPr>
-        <w:t>3. Para qué sirve este diario</w:t>
-      </w:r>
-    </w:p>
-    <w:p>
-      <w:pPr>
-        <w:pStyle w:val="NormalWeb"/>
-        <w:rPr>
-          <w:rFonts w:ascii="Calibri" w:hAnsi="Calibri" w:cs="Calibri"/>
-          <w:color w:val="222222"/>
-          <w:sz w:val="22"/>
-          <w:szCs w:val="22"/>
-          <w:lang w:val="es-ES"/>
-        </w:rPr>
-      </w:pPr>
-      <w:r>
-        <w:rPr>
-          <w:rFonts w:ascii="Calibri" w:hAnsi="Calibri" w:cs="Calibri"/>
-          <w:color w:val="222222"/>
-          <w:sz w:val="22"/>
-          <w:szCs w:val="22"/>
-          <w:lang w:val="es-ES"/>
-        </w:rPr>
-        <w:t>Este diario no es un listado de tareas. Es el registro de lo que hice desde mi rol, lo que decidimos como equipo y lo que aprendí al definir el Proyecto APT. En Fase 1 el portafolio pide analizar evidencias, reconocer fortalezas e intereses profesionales, y dejar un proyecto factible, alineado al perfil de egreso.</w:t>
-      </w:r>
-    </w:p>
-    <w:p>
-      <w:pPr>
-        <w:pStyle w:val="Heading2"/>
-        <w:rPr>
-          <w:rFonts w:ascii="Calibri" w:eastAsia="Times New Roman" w:hAnsi="Calibri" w:cs="Calibri"/>
-          <w:lang w:val="es-ES"/>
-        </w:rPr>
-      </w:pPr>
-      <w:r>
-        <w:rPr>
-          <w:rFonts w:ascii="Calibri" w:eastAsia="Times New Roman" w:hAnsi="Calibri" w:cs="Calibri"/>
-          <w:lang w:val="es-ES"/>
-        </w:rPr>
-        <w:t>4. Entradas del periodo</w:t>
-      </w:r>
-    </w:p>
-    <w:p>
-      <w:pPr>
-        <w:pStyle w:val="Heading3"/>
-        <w:divId w:val="114493525"/>
-        <w:rPr>
-          <w:rFonts w:ascii="Calibri" w:eastAsia="Times New Roman" w:hAnsi="Calibri" w:cs="Calibri"/>
-          <w:lang w:val="es-ES"/>
-        </w:rPr>
-      </w:pPr>
-      <w:r>
-        <w:rPr>
-          <w:rFonts w:ascii="Calibri" w:eastAsia="Times New Roman" w:hAnsi="Calibri" w:cs="Calibri"/>
-          <w:lang w:val="es-ES"/>
-        </w:rPr>
-        <w:t>Entrada 1 — 15 de agosto de 2026</w:t>
-      </w:r>
-    </w:p>
-    <w:p>
-      <w:pPr>
-        <w:pStyle w:val="NormalWeb"/>
-        <w:divId w:val="114493525"/>
-        <w:rPr>
-          <w:rFonts w:ascii="Calibri" w:hAnsi="Calibri" w:cs="Calibri"/>
-          <w:color w:val="222222"/>
-          <w:sz w:val="22"/>
-          <w:szCs w:val="22"/>
-          <w:lang w:val="es-ES"/>
-        </w:rPr>
-      </w:pPr>
-      <w:r>
-        <w:rPr>
-          <w:rStyle w:val="label1"/>
-          <w:rFonts w:ascii="Calibri" w:hAnsi="Calibri" w:cs="Calibri"/>
-          <w:sz w:val="22"/>
-          <w:szCs w:val="22"/>
-          <w:lang w:val="es-ES"/>
-        </w:rPr>
-        <w:t>Qué ocurrió.</w:t>
-      </w:r>
-      <w:r>
-        <w:rPr>
-          <w:rFonts w:ascii="Calibri" w:hAnsi="Calibri" w:cs="Calibri"/>
-          <w:color w:val="222222"/>
-          <w:sz w:val="22"/>
-          <w:szCs w:val="22"/>
-          <w:lang w:val="es-ES"/>
-        </w:rPr>
-        <w:t xml:space="preserve"> Retomé el sistema La 200 con la idea de presentarlo como proyecto de título. El código existía; lo que no existía con claridad era el relato académico y la división de roles. Todavía era fácil hablar de “nuestro sistema” como si los tres hiciéramos lo mismo y como si nosotros atendiéramos el local.</w:t>
-      </w:r>
-    </w:p>
-    <w:p>
-      <w:pPr>
-        <w:pStyle w:val="NormalWeb"/>
-        <w:divId w:val="114493525"/>
-        <w:rPr>
-          <w:rFonts w:ascii="Calibri" w:hAnsi="Calibri" w:cs="Calibri"/>
-          <w:color w:val="222222"/>
-          <w:sz w:val="22"/>
-          <w:szCs w:val="22"/>
-          <w:lang w:val="es-ES"/>
-        </w:rPr>
-      </w:pPr>
-      <w:r>
-        <w:rPr>
-          <w:rStyle w:val="label1"/>
-          <w:rFonts w:ascii="Calibri" w:hAnsi="Calibri" w:cs="Calibri"/>
-          <w:sz w:val="22"/>
-          <w:szCs w:val="22"/>
-          <w:lang w:val="es-ES"/>
-        </w:rPr>
-        <w:t>Qué pensé y sentí.</w:t>
-      </w:r>
-      <w:r>
-        <w:rPr>
-          <w:rFonts w:ascii="Calibri" w:hAnsi="Calibri" w:cs="Calibri"/>
-          <w:color w:val="222222"/>
-          <w:sz w:val="22"/>
-          <w:szCs w:val="22"/>
-          <w:lang w:val="es-ES"/>
-        </w:rPr>
-        <w:t xml:space="preserve"> </w:t>
-      </w:r>
-      <w:r>
-        <w:rPr>
-          <w:rFonts w:ascii="Calibri" w:hAnsi="Calibri" w:cs="Calibri"/>
-          <w:color w:val="222222"/>
-          <w:sz w:val="22"/>
-          <w:szCs w:val="22"/>
-          <w:lang w:val="es-ES"/>
-        </w:rPr>
-        <w:t>Había tensión: da seguridad tener software que se puede mostrar, pero un prototipo sin problema bien planteado y sin roles no es un Proyecto APT. También me preocupó el GitHub institucional: el ramo pide evidencias con nombres y carpetas, y no queríamos subir a destiempo.</w:t>
-      </w:r>
-    </w:p>
-    <w:p>
-      <w:pPr>
-        <w:pStyle w:val="NormalWeb"/>
-        <w:divId w:val="114493525"/>
-        <w:rPr>
-          <w:rFonts w:ascii="Calibri" w:hAnsi="Calibri" w:cs="Calibri"/>
-          <w:color w:val="222222"/>
-          <w:sz w:val="22"/>
-          <w:szCs w:val="22"/>
-          <w:lang w:val="es-ES"/>
-        </w:rPr>
-      </w:pPr>
-      <w:r>
-        <w:rPr>
-          <w:rStyle w:val="label1"/>
-          <w:rFonts w:ascii="Calibri" w:hAnsi="Calibri" w:cs="Calibri"/>
-          <w:sz w:val="22"/>
-          <w:szCs w:val="22"/>
-          <w:lang w:val="es-ES"/>
-        </w:rPr>
-        <w:t>Qué hice, desde mi rol.</w:t>
-      </w:r>
-      <w:r>
-        <w:rPr>
-          <w:rFonts w:ascii="Calibri" w:hAnsi="Calibri" w:cs="Calibri"/>
-          <w:color w:val="222222"/>
-          <w:sz w:val="22"/>
-          <w:szCs w:val="22"/>
-          <w:lang w:val="es-ES"/>
-        </w:rPr>
-        <w:t xml:space="preserve"> </w:t>
-      </w:r>
-      <w:r>
-        <w:rPr>
-          <w:rFonts w:ascii="Calibri" w:hAnsi="Calibri" w:cs="Calibri"/>
-          <w:color w:val="222222"/>
-          <w:sz w:val="22"/>
-          <w:szCs w:val="22"/>
-          <w:lang w:val="es-ES"/>
-        </w:rPr>
-        <w:t>Empecé a tratar el sistema como arquitectura (web + escritorio), no como “la app”. Acordamos git local por ahora y dejar el GitHub de la universidad para cuando la estructura de fases esté clara. Levanté el entorno en red local para poder mostrarlo, no solo describirlo.</w:t>
-      </w:r>
-    </w:p>
-    <w:p>
-      <w:pPr>
-        <w:pStyle w:val="NormalWeb"/>
-        <w:divId w:val="114493525"/>
-        <w:rPr>
-          <w:rFonts w:ascii="Calibri" w:hAnsi="Calibri" w:cs="Calibri"/>
-          <w:color w:val="222222"/>
-          <w:sz w:val="22"/>
-          <w:szCs w:val="22"/>
-          <w:lang w:val="es-ES"/>
-        </w:rPr>
-      </w:pPr>
-      <w:r>
-        <w:rPr>
-          <w:rStyle w:val="label1"/>
-          <w:rFonts w:ascii="Calibri" w:hAnsi="Calibri" w:cs="Calibri"/>
-          <w:sz w:val="22"/>
-          <w:szCs w:val="22"/>
-          <w:lang w:val="es-ES"/>
-        </w:rPr>
-        <w:t>Qué aprendí.</w:t>
-      </w:r>
-      <w:r>
-        <w:rPr>
-          <w:rFonts w:ascii="Calibri" w:hAnsi="Calibri" w:cs="Calibri"/>
-          <w:color w:val="222222"/>
-          <w:sz w:val="22"/>
-          <w:szCs w:val="22"/>
-          <w:lang w:val="es-ES"/>
-        </w:rPr>
-        <w:t xml:space="preserve"> </w:t>
-      </w:r>
-      <w:r>
-        <w:rPr>
-          <w:rFonts w:ascii="Calibri" w:hAnsi="Calibri" w:cs="Calibri"/>
-          <w:color w:val="222222"/>
-          <w:sz w:val="22"/>
-          <w:szCs w:val="22"/>
-          <w:lang w:val="es-ES"/>
-        </w:rPr>
-        <w:t>En título, “ya lo programé” no reemplaza el para quién y el quién hace qué. Mi interés —arquitectura y desarrollo— solo tiene sentido si Joaquín prioriza producto y Benjamín cubre pagos y operación, y si el usuario del POS no somos nosotros.</w:t>
-      </w:r>
-    </w:p>
-    <w:p>
-      <w:pPr>
-        <w:pStyle w:val="Heading3"/>
-        <w:divId w:val="867596395"/>
-        <w:rPr>
-          <w:rFonts w:ascii="Calibri" w:eastAsia="Times New Roman" w:hAnsi="Calibri" w:cs="Calibri"/>
-          <w:lang w:val="es-ES"/>
-        </w:rPr>
-      </w:pPr>
-      <w:r>
-        <w:rPr>
-          <w:rFonts w:ascii="Calibri" w:eastAsia="Times New Roman" w:hAnsi="Calibri" w:cs="Calibri"/>
-          <w:lang w:val="es-ES"/>
-        </w:rPr>
-        <w:t>Entrada 2 — 18 de agosto de 2026</w:t>
-      </w:r>
-    </w:p>
-    <w:p>
-      <w:pPr>
-        <w:pStyle w:val="NormalWeb"/>
-        <w:divId w:val="867596395"/>
-        <w:rPr>
-          <w:rFonts w:ascii="Calibri" w:hAnsi="Calibri" w:cs="Calibri"/>
-          <w:color w:val="222222"/>
-          <w:sz w:val="22"/>
-          <w:szCs w:val="22"/>
-          <w:lang w:val="es-ES"/>
-        </w:rPr>
-      </w:pPr>
-      <w:r>
-        <w:rPr>
-          <w:rStyle w:val="label1"/>
-          <w:rFonts w:ascii="Calibri" w:hAnsi="Calibri" w:cs="Calibri"/>
-          <w:sz w:val="22"/>
-          <w:szCs w:val="22"/>
-          <w:lang w:val="es-ES"/>
-        </w:rPr>
-        <w:lastRenderedPageBreak/>
-        <w:t>Qué ocurrió.</w:t>
-      </w:r>
-      <w:r>
-        <w:rPr>
-          <w:rFonts w:ascii="Calibri" w:hAnsi="Calibri" w:cs="Calibri"/>
-          <w:color w:val="222222"/>
-          <w:sz w:val="22"/>
-          <w:szCs w:val="22"/>
-          <w:lang w:val="es-ES"/>
-        </w:rPr>
-        <w:t xml:space="preserve"> Sesión de arquitectura y de reglas de negocio, alineada después con la lámina de las tres puertas. Separamos el repositorio en </w:t>
-      </w:r>
-      <w:r>
-        <w:rPr>
-          <w:rFonts w:ascii="Calibri" w:hAnsi="Calibri" w:cs="Calibri"/>
-          <w:i/>
-          <w:iCs/>
-          <w:color w:val="222222"/>
-          <w:sz w:val="22"/>
-          <w:szCs w:val="22"/>
-          <w:lang w:val="es-ES"/>
-        </w:rPr>
-        <w:t>web/</w:t>
-      </w:r>
-      <w:r>
-        <w:rPr>
-          <w:rFonts w:ascii="Calibri" w:hAnsi="Calibri" w:cs="Calibri"/>
-          <w:color w:val="222222"/>
-          <w:sz w:val="22"/>
-          <w:szCs w:val="22"/>
-          <w:lang w:val="es-ES"/>
-        </w:rPr>
-        <w:t xml:space="preserve"> y </w:t>
-      </w:r>
-      <w:r>
-        <w:rPr>
-          <w:rFonts w:ascii="Calibri" w:hAnsi="Calibri" w:cs="Calibri"/>
-          <w:i/>
-          <w:iCs/>
-          <w:color w:val="222222"/>
-          <w:sz w:val="22"/>
-          <w:szCs w:val="22"/>
-          <w:lang w:val="es-ES"/>
-        </w:rPr>
-        <w:t>desktop/</w:t>
-      </w:r>
-      <w:r>
-        <w:rPr>
-          <w:rFonts w:ascii="Calibri" w:hAnsi="Calibri" w:cs="Calibri"/>
-          <w:color w:val="222222"/>
-          <w:sz w:val="22"/>
-          <w:szCs w:val="22"/>
-          <w:lang w:val="es-ES"/>
-        </w:rPr>
-        <w:t>. Tres decisiones que quedaron en la propuesta: el administrador no entra por la web del local; el login de Mitzi lleva usuario, contraseña y Google Authenticator; el retiro no se valida con un código por WhatsApp.</w:t>
-      </w:r>
-    </w:p>
-    <w:p>
-      <w:pPr>
-        <w:pStyle w:val="NormalWeb"/>
-        <w:divId w:val="867596395"/>
-        <w:rPr>
-          <w:rFonts w:ascii="Calibri" w:hAnsi="Calibri" w:cs="Calibri"/>
-          <w:color w:val="222222"/>
-          <w:sz w:val="22"/>
-          <w:szCs w:val="22"/>
-          <w:lang w:val="es-ES"/>
-        </w:rPr>
-      </w:pPr>
-      <w:r>
-        <w:rPr>
-          <w:rStyle w:val="label1"/>
-          <w:rFonts w:ascii="Calibri" w:hAnsi="Calibri" w:cs="Calibri"/>
-          <w:sz w:val="22"/>
-          <w:szCs w:val="22"/>
-          <w:lang w:val="es-ES"/>
-        </w:rPr>
-        <w:t>Qué pensé y sentí.</w:t>
-      </w:r>
-      <w:r>
-        <w:rPr>
-          <w:rFonts w:ascii="Calibri" w:hAnsi="Calibri" w:cs="Calibri"/>
-          <w:color w:val="222222"/>
-          <w:sz w:val="22"/>
-          <w:szCs w:val="22"/>
-          <w:lang w:val="es-ES"/>
-        </w:rPr>
-        <w:t xml:space="preserve"> </w:t>
-      </w:r>
-      <w:r>
-        <w:rPr>
-          <w:rFonts w:ascii="Calibri" w:hAnsi="Calibri" w:cs="Calibri"/>
-          <w:color w:val="222222"/>
-          <w:sz w:val="22"/>
-          <w:szCs w:val="22"/>
-          <w:lang w:val="es-ES"/>
-        </w:rPr>
-        <w:t>WhatsApp parecía fácil. Era un parche: dependía de otra app y de un código reenviable. Nombre y teléfono obligatorios son más humildes y más difíciles de adivinar que un número de pedido. Sacar el admin de la tablet también me alivió: dejaba de mezclar a Mitzi con el trabajador que solo necesita vender.</w:t>
-      </w:r>
-    </w:p>
-    <w:p>
-      <w:pPr>
-        <w:pStyle w:val="NormalWeb"/>
-        <w:divId w:val="867596395"/>
-        <w:rPr>
-          <w:rFonts w:ascii="Calibri" w:hAnsi="Calibri" w:cs="Calibri"/>
-          <w:color w:val="222222"/>
-          <w:sz w:val="22"/>
-          <w:szCs w:val="22"/>
-          <w:lang w:val="es-ES"/>
-        </w:rPr>
-      </w:pPr>
-      <w:r>
-        <w:rPr>
-          <w:rStyle w:val="label1"/>
-          <w:rFonts w:ascii="Calibri" w:hAnsi="Calibri" w:cs="Calibri"/>
-          <w:sz w:val="22"/>
-          <w:szCs w:val="22"/>
-          <w:lang w:val="es-ES"/>
-        </w:rPr>
-        <w:t>Dificultad.</w:t>
-      </w:r>
-      <w:r>
-        <w:rPr>
-          <w:rFonts w:ascii="Calibri" w:hAnsi="Calibri" w:cs="Calibri"/>
-          <w:color w:val="222222"/>
-          <w:sz w:val="22"/>
-          <w:szCs w:val="22"/>
-          <w:lang w:val="es-ES"/>
-        </w:rPr>
-        <w:t xml:space="preserve"> </w:t>
-      </w:r>
-      <w:r>
-        <w:rPr>
-          <w:rFonts w:ascii="Calibri" w:hAnsi="Calibri" w:cs="Calibri"/>
-          <w:color w:val="222222"/>
-          <w:sz w:val="22"/>
-          <w:szCs w:val="22"/>
-          <w:lang w:val="es-ES"/>
-        </w:rPr>
-        <w:t>Mover la administración a escritorio (Electron, TOTP) es más trabajo en el tiempo del ramo, y cae en mi rol. La alternativa —dejar todo en la tablet— era más rápida y peor. Joaquín priorizó la decisión de producto (admin fuera); yo la traduje a diseño técnico.</w:t>
-      </w:r>
-    </w:p>
-    <w:p>
-      <w:pPr>
-        <w:pStyle w:val="NormalWeb"/>
-        <w:divId w:val="867596395"/>
-        <w:rPr>
-          <w:rFonts w:ascii="Calibri" w:hAnsi="Calibri" w:cs="Calibri"/>
-          <w:color w:val="222222"/>
-          <w:sz w:val="22"/>
-          <w:szCs w:val="22"/>
-          <w:lang w:val="es-ES"/>
-        </w:rPr>
-      </w:pPr>
-      <w:r>
-        <w:rPr>
-          <w:rStyle w:val="label1"/>
-          <w:rFonts w:ascii="Calibri" w:hAnsi="Calibri" w:cs="Calibri"/>
-          <w:sz w:val="22"/>
-          <w:szCs w:val="22"/>
-          <w:lang w:val="es-ES"/>
-        </w:rPr>
-        <w:t>Reparto.</w:t>
-      </w:r>
-      <w:r>
-        <w:rPr>
-          <w:rFonts w:ascii="Calibri" w:hAnsi="Calibri" w:cs="Calibri"/>
-          <w:color w:val="222222"/>
-          <w:sz w:val="22"/>
-          <w:szCs w:val="22"/>
-          <w:lang w:val="es-ES"/>
-        </w:rPr>
-        <w:t xml:space="preserve"> </w:t>
-      </w:r>
-      <w:r>
-        <w:rPr>
-          <w:rFonts w:ascii="Calibri" w:hAnsi="Calibri" w:cs="Calibri"/>
-          <w:color w:val="222222"/>
-          <w:sz w:val="22"/>
-          <w:szCs w:val="22"/>
-          <w:lang w:val="es-ES"/>
-        </w:rPr>
-        <w:t>Lo de cobrar en el mostrador y el pedido en línea no lo resuelvo yo solo: es el rol de Benjamín (pagos, pedidos, operación). Mi parte fue dejar las puertas cortadas para que esas integraciones no vivan en la misma pantalla que el Authenticator de Mitzi.</w:t>
-      </w:r>
-    </w:p>
-    <w:p>
-      <w:pPr>
-        <w:pStyle w:val="NormalWeb"/>
-        <w:divId w:val="867596395"/>
-        <w:rPr>
-          <w:rFonts w:ascii="Calibri" w:hAnsi="Calibri" w:cs="Calibri"/>
-          <w:color w:val="222222"/>
-          <w:sz w:val="22"/>
-          <w:szCs w:val="22"/>
-          <w:lang w:val="es-ES"/>
-        </w:rPr>
-      </w:pPr>
-      <w:r>
-        <w:rPr>
-          <w:rStyle w:val="label1"/>
-          <w:rFonts w:ascii="Calibri" w:hAnsi="Calibri" w:cs="Calibri"/>
-          <w:sz w:val="22"/>
-          <w:szCs w:val="22"/>
-          <w:lang w:val="es-ES"/>
-        </w:rPr>
-        <w:t>Qué aprendí.</w:t>
-      </w:r>
-      <w:r>
-        <w:rPr>
-          <w:rFonts w:ascii="Calibri" w:hAnsi="Calibri" w:cs="Calibri"/>
-          <w:color w:val="222222"/>
-          <w:sz w:val="22"/>
-          <w:szCs w:val="22"/>
-          <w:lang w:val="es-ES"/>
-        </w:rPr>
-        <w:t xml:space="preserve"> Arquitectura no es dibujar cajas. Es decidir qué no va en cada pantalla. La nota de la propuesta lo dice en una frase: Mitzi es la dueña; quienes usan el sistema en el local son los trabajadores mayores, no nosotros.</w:t>
-      </w:r>
-    </w:p>
-    <w:p>
-      <w:pPr>
-        <w:pStyle w:val="Heading3"/>
-        <w:divId w:val="1597399345"/>
-        <w:rPr>
-          <w:rFonts w:ascii="Calibri" w:eastAsia="Times New Roman" w:hAnsi="Calibri" w:cs="Calibri"/>
-          <w:lang w:val="es-ES"/>
-        </w:rPr>
-      </w:pPr>
-      <w:r>
-        <w:rPr>
-          <w:rFonts w:ascii="Calibri" w:eastAsia="Times New Roman" w:hAnsi="Calibri" w:cs="Calibri"/>
-          <w:lang w:val="es-ES"/>
-        </w:rPr>
-        <w:t>Entrada 3 — 21 y 22 de agosto de 2026</w:t>
-      </w:r>
-    </w:p>
-    <w:p>
-      <w:pPr>
-        <w:pStyle w:val="NormalWeb"/>
-        <w:divId w:val="1597399345"/>
-        <w:rPr>
-          <w:rFonts w:ascii="Calibri" w:hAnsi="Calibri" w:cs="Calibri"/>
-          <w:color w:val="222222"/>
-          <w:sz w:val="22"/>
-          <w:szCs w:val="22"/>
-          <w:lang w:val="es-ES"/>
-        </w:rPr>
-      </w:pPr>
-      <w:r>
-        <w:rPr>
-          <w:rStyle w:val="label1"/>
-          <w:rFonts w:ascii="Calibri" w:hAnsi="Calibri" w:cs="Calibri"/>
-          <w:sz w:val="22"/>
-          <w:szCs w:val="22"/>
-          <w:lang w:val="es-ES"/>
-        </w:rPr>
-        <w:t>Qué ocurrió.</w:t>
-      </w:r>
-      <w:r>
-        <w:rPr>
-          <w:rFonts w:ascii="Calibri" w:hAnsi="Calibri" w:cs="Calibri"/>
-          <w:color w:val="222222"/>
-          <w:sz w:val="22"/>
-          <w:szCs w:val="22"/>
-          <w:lang w:val="es-ES"/>
-        </w:rPr>
-        <w:t xml:space="preserve"> Probamos escritorio y web, incluso con el celular como hotspot. Quedaron usuarios de desarrollo para los tres del equipo, para Mitzi (admin) y para un vendedor. Ajustes de interfaz del POS y de la tienda: filtros de producto, pedidos entregados separados de los pendientes, más tarjetas por fila en la lista del vendedor.</w:t>
-      </w:r>
-    </w:p>
-    <w:p>
-      <w:pPr>
-        <w:pStyle w:val="NormalWeb"/>
-        <w:divId w:val="1597399345"/>
-        <w:rPr>
-          <w:rFonts w:ascii="Calibri" w:hAnsi="Calibri" w:cs="Calibri"/>
-          <w:color w:val="222222"/>
-          <w:sz w:val="22"/>
-          <w:szCs w:val="22"/>
-          <w:lang w:val="es-ES"/>
-        </w:rPr>
-      </w:pPr>
-      <w:r>
-        <w:rPr>
-          <w:rStyle w:val="label1"/>
-          <w:rFonts w:ascii="Calibri" w:hAnsi="Calibri" w:cs="Calibri"/>
-          <w:sz w:val="22"/>
-          <w:szCs w:val="22"/>
-          <w:lang w:val="es-ES"/>
-        </w:rPr>
-        <w:t>Qué pensé y sentí.</w:t>
-      </w:r>
-      <w:r>
-        <w:rPr>
-          <w:rFonts w:ascii="Calibri" w:hAnsi="Calibri" w:cs="Calibri"/>
-          <w:color w:val="222222"/>
-          <w:sz w:val="22"/>
-          <w:szCs w:val="22"/>
-          <w:lang w:val="es-ES"/>
-        </w:rPr>
-        <w:t xml:space="preserve"> </w:t>
-      </w:r>
-      <w:r>
-        <w:rPr>
-          <w:rFonts w:ascii="Calibri" w:hAnsi="Calibri" w:cs="Calibri"/>
-          <w:color w:val="222222"/>
-          <w:sz w:val="22"/>
-          <w:szCs w:val="22"/>
-          <w:lang w:val="es-ES"/>
-        </w:rPr>
-        <w:t>Probar en una red que no es localhost cambia el proyecto. Aparece la IP, el firewall, el “en el local no va a ser tu notebook”. Sirvió para bajar el sistema al escenario de la parcelación, aunque todavía no estemos instalados ahí.</w:t>
-      </w:r>
-    </w:p>
-    <w:p>
-      <w:pPr>
-        <w:pStyle w:val="NormalWeb"/>
-        <w:divId w:val="1597399345"/>
-        <w:rPr>
-          <w:rFonts w:ascii="Calibri" w:hAnsi="Calibri" w:cs="Calibri"/>
-          <w:color w:val="222222"/>
-          <w:sz w:val="22"/>
-          <w:szCs w:val="22"/>
-          <w:lang w:val="es-ES"/>
-        </w:rPr>
-      </w:pPr>
-      <w:r>
-        <w:rPr>
-          <w:rStyle w:val="label1"/>
-          <w:rFonts w:ascii="Calibri" w:hAnsi="Calibri" w:cs="Calibri"/>
-          <w:sz w:val="22"/>
-          <w:szCs w:val="22"/>
-          <w:lang w:val="es-ES"/>
-        </w:rPr>
-        <w:t>Trabajo en equipo, con los roles de la propuesta.</w:t>
-      </w:r>
-      <w:r>
-        <w:rPr>
-          <w:rFonts w:ascii="Calibri" w:hAnsi="Calibri" w:cs="Calibri"/>
-          <w:color w:val="222222"/>
-          <w:sz w:val="22"/>
-          <w:szCs w:val="22"/>
-          <w:lang w:val="es-ES"/>
-        </w:rPr>
-        <w:t xml:space="preserve"> </w:t>
-      </w:r>
-      <w:r>
-        <w:rPr>
-          <w:rFonts w:ascii="Calibri" w:hAnsi="Calibri" w:cs="Calibri"/>
-          <w:color w:val="222222"/>
-          <w:sz w:val="22"/>
-          <w:szCs w:val="22"/>
-          <w:lang w:val="es-ES"/>
-        </w:rPr>
-        <w:t>Joaquín prioriza producto (qué se ve primero, qué se recorta). Yo sostengo el diseño técnico y el desarrollo de las tres puertas. Benjamín se mueve en lo que el local necesita para cobrar y entregar. La prueba conjunta evitó que cada uno dejara “su parte” sin mirar el flujo: pedir, pagar, ver stock, entregar. Mitzi no prueba como cuarta alumna: prueba como dueña, cuando llegue el momento.</w:t>
-      </w:r>
-    </w:p>
-    <w:p>
-      <w:pPr>
-        <w:pStyle w:val="NormalWeb"/>
-        <w:divId w:val="1597399345"/>
-        <w:rPr>
-          <w:rFonts w:ascii="Calibri" w:hAnsi="Calibri" w:cs="Calibri"/>
-          <w:color w:val="222222"/>
-          <w:sz w:val="22"/>
-          <w:szCs w:val="22"/>
-          <w:lang w:val="es-ES"/>
-        </w:rPr>
-      </w:pPr>
-      <w:r>
-        <w:rPr>
-          <w:rStyle w:val="label1"/>
-          <w:rFonts w:ascii="Calibri" w:hAnsi="Calibri" w:cs="Calibri"/>
-          <w:sz w:val="22"/>
-          <w:szCs w:val="22"/>
-          <w:lang w:val="es-ES"/>
-        </w:rPr>
-        <w:t>Qué aprendí.</w:t>
-      </w:r>
-      <w:r>
-        <w:rPr>
-          <w:rFonts w:ascii="Calibri" w:hAnsi="Calibri" w:cs="Calibri"/>
-          <w:color w:val="222222"/>
-          <w:sz w:val="22"/>
-          <w:szCs w:val="22"/>
-          <w:lang w:val="es-ES"/>
-        </w:rPr>
-        <w:t xml:space="preserve"> </w:t>
-      </w:r>
-      <w:r>
-        <w:rPr>
-          <w:rFonts w:ascii="Calibri" w:hAnsi="Calibri" w:cs="Calibri"/>
-          <w:color w:val="222222"/>
-          <w:sz w:val="22"/>
-          <w:szCs w:val="22"/>
-          <w:lang w:val="es-ES"/>
-        </w:rPr>
-        <w:t>Un POS para un trabajador mayor no se evalúa por la cantidad de funciones, sino por si se entiende al primer toque. Eso es tan profesional como elegir FastAPI, y es coherente con la intención de la propuesta: incluir a quien atiende.</w:t>
-      </w:r>
-    </w:p>
-    <w:p>
-      <w:pPr>
-        <w:pStyle w:val="Heading3"/>
-        <w:divId w:val="730734345"/>
-        <w:rPr>
-          <w:rFonts w:ascii="Calibri" w:eastAsia="Times New Roman" w:hAnsi="Calibri" w:cs="Calibri"/>
-          <w:lang w:val="es-ES"/>
-        </w:rPr>
-      </w:pPr>
-      <w:r>
-        <w:rPr>
-          <w:rFonts w:ascii="Calibri" w:eastAsia="Times New Roman" w:hAnsi="Calibri" w:cs="Calibri"/>
-          <w:lang w:val="es-ES"/>
-        </w:rPr>
-        <w:t>Entrada 4 — 27 y 28 de agosto de 2026</w:t>
-      </w:r>
-    </w:p>
-    <w:p>
-      <w:pPr>
-        <w:pStyle w:val="NormalWeb"/>
-        <w:divId w:val="730734345"/>
-        <w:rPr>
-          <w:rFonts w:ascii="Calibri" w:hAnsi="Calibri" w:cs="Calibri"/>
-          <w:color w:val="222222"/>
-          <w:sz w:val="22"/>
-          <w:szCs w:val="22"/>
-          <w:lang w:val="es-ES"/>
-        </w:rPr>
-      </w:pPr>
-      <w:r>
-        <w:rPr>
-          <w:rStyle w:val="label1"/>
-          <w:rFonts w:ascii="Calibri" w:hAnsi="Calibri" w:cs="Calibri"/>
-          <w:sz w:val="22"/>
-          <w:szCs w:val="22"/>
-          <w:lang w:val="es-ES"/>
-        </w:rPr>
-        <w:t>Qué ocurrió.</w:t>
-      </w:r>
-      <w:r>
-        <w:rPr>
-          <w:rFonts w:ascii="Calibri" w:hAnsi="Calibri" w:cs="Calibri"/>
-          <w:color w:val="222222"/>
-          <w:sz w:val="22"/>
-          <w:szCs w:val="22"/>
-          <w:lang w:val="es-ES"/>
-        </w:rPr>
-        <w:t xml:space="preserve"> </w:t>
-      </w:r>
-      <w:r>
-        <w:rPr>
-          <w:rFonts w:ascii="Calibri" w:hAnsi="Calibri" w:cs="Calibri"/>
-          <w:color w:val="222222"/>
-          <w:sz w:val="22"/>
-          <w:szCs w:val="22"/>
-          <w:lang w:val="es-ES"/>
-        </w:rPr>
-        <w:t>Cerramos la propuesta (12 láminas) con la pauta del ramo: nombre, integrantes y roles, idea y contexto, problema, solución por storytelling, objetivo general, seis objetivos específicos y metodología ágil. Corregimos el relato: Mitzi no es integrante, no hay fotos de personas, no es un kiosco de barrio, el rubro es limpieza y las bebidas no se mencionan.</w:t>
-      </w:r>
-    </w:p>
-    <w:p>
-      <w:pPr>
-        <w:pStyle w:val="NormalWeb"/>
-        <w:divId w:val="730734345"/>
-        <w:rPr>
-          <w:rFonts w:ascii="Calibri" w:hAnsi="Calibri" w:cs="Calibri"/>
-          <w:color w:val="222222"/>
-          <w:sz w:val="22"/>
-          <w:szCs w:val="22"/>
-          <w:lang w:val="es-ES"/>
-        </w:rPr>
-      </w:pPr>
-      <w:r>
-        <w:rPr>
-          <w:rStyle w:val="label1"/>
-          <w:rFonts w:ascii="Calibri" w:hAnsi="Calibri" w:cs="Calibri"/>
-          <w:sz w:val="22"/>
-          <w:szCs w:val="22"/>
-          <w:lang w:val="es-ES"/>
-        </w:rPr>
-        <w:t>Qué pensé y sentí.</w:t>
-      </w:r>
-      <w:r>
-        <w:rPr>
-          <w:rFonts w:ascii="Calibri" w:hAnsi="Calibri" w:cs="Calibri"/>
-          <w:color w:val="222222"/>
-          <w:sz w:val="22"/>
-          <w:szCs w:val="22"/>
-          <w:lang w:val="es-ES"/>
-        </w:rPr>
-        <w:t xml:space="preserve"> </w:t>
-      </w:r>
-      <w:r>
-        <w:rPr>
-          <w:rFonts w:ascii="Calibri" w:hAnsi="Calibri" w:cs="Calibri"/>
-          <w:color w:val="222222"/>
-          <w:sz w:val="22"/>
-          <w:szCs w:val="22"/>
-          <w:lang w:val="es-ES"/>
-        </w:rPr>
-        <w:t>Me incomodó haber arrastrado un relato incorrecto. Corregirlo a tiempo es Fase 1: definir bien antes de que la comisión evalúe otra cosa. Presentar a los tres integrantes y, después, dejar claro que Mitzi es la dueña y que el POS lo usan trabajadores mayores, no nosotros, ordenó también mi autoevaluación: ya no puedo escribir como si yo fuera “el proyecto entero”.</w:t>
-      </w:r>
-    </w:p>
-    <w:p>
-      <w:pPr>
-        <w:pStyle w:val="NormalWeb"/>
-        <w:divId w:val="730734345"/>
-        <w:rPr>
-          <w:rFonts w:ascii="Calibri" w:hAnsi="Calibri" w:cs="Calibri"/>
-          <w:color w:val="222222"/>
-          <w:sz w:val="22"/>
-          <w:szCs w:val="22"/>
-          <w:lang w:val="es-ES"/>
-        </w:rPr>
-      </w:pPr>
-      <w:r>
-        <w:rPr>
-          <w:rStyle w:val="label1"/>
-          <w:rFonts w:ascii="Calibri" w:hAnsi="Calibri" w:cs="Calibri"/>
-          <w:sz w:val="22"/>
-          <w:szCs w:val="22"/>
-          <w:lang w:val="es-ES"/>
-        </w:rPr>
-        <w:t>Relación con mis intereses.</w:t>
-      </w:r>
-      <w:r>
-        <w:rPr>
-          <w:rFonts w:ascii="Calibri" w:hAnsi="Calibri" w:cs="Calibri"/>
-          <w:color w:val="222222"/>
-          <w:sz w:val="22"/>
-          <w:szCs w:val="22"/>
-          <w:lang w:val="es-ES"/>
-        </w:rPr>
-        <w:t xml:space="preserve"> </w:t>
-      </w:r>
-      <w:r>
-        <w:rPr>
-          <w:rFonts w:ascii="Calibri" w:hAnsi="Calibri" w:cs="Calibri"/>
-          <w:color w:val="222222"/>
-          <w:sz w:val="22"/>
-          <w:szCs w:val="22"/>
-          <w:lang w:val="es-ES"/>
-        </w:rPr>
-        <w:t>El objetivo general —gestión, venta y retiro, interfaz accesible, canal en línea, sin excluir a quien atiende ni a quien compra— describe el tipo de ingeniero que quiero ser. Mi lámina de rol (diseño técnico, backend, frontend, escritorio) es la forma concreta de ese interés. No es la de jefe de proyecto ni la de integraciones de pago; esas son de Joaquín y de Benjamín.</w:t>
-      </w:r>
-    </w:p>
-    <w:p>
-      <w:pPr>
-        <w:pStyle w:val="NormalWeb"/>
-        <w:divId w:val="730734345"/>
-        <w:rPr>
-          <w:rFonts w:ascii="Calibri" w:hAnsi="Calibri" w:cs="Calibri"/>
-          <w:color w:val="222222"/>
-          <w:sz w:val="22"/>
-          <w:szCs w:val="22"/>
-          <w:lang w:val="es-ES"/>
-        </w:rPr>
-      </w:pPr>
-      <w:r>
-        <w:rPr>
-          <w:rStyle w:val="label1"/>
-          <w:rFonts w:ascii="Calibri" w:hAnsi="Calibri" w:cs="Calibri"/>
-          <w:sz w:val="22"/>
-          <w:szCs w:val="22"/>
-          <w:lang w:val="es-ES"/>
-        </w:rPr>
-        <w:t>Qué aprendí.</w:t>
-      </w:r>
-      <w:r>
-        <w:rPr>
-          <w:rFonts w:ascii="Calibri" w:hAnsi="Calibri" w:cs="Calibri"/>
-          <w:color w:val="222222"/>
-          <w:sz w:val="22"/>
-          <w:szCs w:val="22"/>
-          <w:lang w:val="es-ES"/>
-        </w:rPr>
-        <w:t xml:space="preserve"> </w:t>
-      </w:r>
-      <w:r>
-        <w:rPr>
-          <w:rFonts w:ascii="Calibri" w:hAnsi="Calibri" w:cs="Calibri"/>
-          <w:color w:val="222222"/>
-          <w:sz w:val="22"/>
-          <w:szCs w:val="22"/>
-          <w:lang w:val="es-ES"/>
-        </w:rPr>
-        <w:t>Ágil, no Waterfall, porque el local real y quienes lo atienden van a corregirnos. Ya cambiaron requisitos. Joaquín sostiene esa priorización; yo dimensiono lo técnico de cada sprint (POS e inventario; tienda; pagos con Benjamín; escritorio y 2FA; pulido y GitHub).</w:t>
-      </w:r>
-    </w:p>
-    <w:p>
-      <w:pPr>
-        <w:pStyle w:val="Heading2"/>
-        <w:rPr>
-          <w:rFonts w:ascii="Calibri" w:eastAsia="Times New Roman" w:hAnsi="Calibri" w:cs="Calibri"/>
-          <w:lang w:val="es-ES"/>
-        </w:rPr>
-      </w:pPr>
-      <w:r>
-        <w:rPr>
-          <w:rFonts w:ascii="Calibri" w:eastAsia="Times New Roman" w:hAnsi="Calibri" w:cs="Calibri"/>
-          <w:lang w:val="es-ES"/>
-        </w:rPr>
-        <w:t>5. Síntesis de la Fase 1</w:t>
-      </w:r>
-    </w:p>
-    <w:p>
-      <w:pPr>
-        <w:pStyle w:val="Heading3"/>
-        <w:rPr>
-          <w:rFonts w:ascii="Calibri" w:eastAsia="Times New Roman" w:hAnsi="Calibri" w:cs="Calibri"/>
-          <w:lang w:val="es-ES"/>
-        </w:rPr>
-      </w:pPr>
-      <w:r>
-        <w:rPr>
-          <w:rFonts w:ascii="Calibri" w:eastAsia="Times New Roman" w:hAnsi="Calibri" w:cs="Calibri"/>
-          <w:lang w:val="es-ES"/>
-        </w:rPr>
-        <w:t>Qué se logró</w:t>
-      </w:r>
-    </w:p>
-    <w:p>
-      <w:pPr>
-        <w:pStyle w:val="NormalWeb"/>
-        <w:rPr>
-          <w:rFonts w:ascii="Calibri" w:hAnsi="Calibri" w:cs="Calibri"/>
-          <w:color w:val="222222"/>
-          <w:sz w:val="22"/>
-          <w:szCs w:val="22"/>
-          <w:lang w:val="es-ES"/>
-        </w:rPr>
-      </w:pPr>
-      <w:r>
-        <w:rPr>
-          <w:rFonts w:ascii="Calibri" w:hAnsi="Calibri" w:cs="Calibri"/>
-          <w:color w:val="222222"/>
-          <w:sz w:val="22"/>
-          <w:szCs w:val="22"/>
-          <w:lang w:val="es-ES"/>
-        </w:rPr>
-        <w:t>El Proyecto APT está definido en los términos de la propuesta: problema, tres usuarios (dueña, trabajador mayor, residente), tres puertas, objetivos, stack y cinco sprints. Existe un prototipo demostrable en red local. El equipo tiene roles que se pueden explicar en una lámina. La dueña y los trabajadores mayores están en el centro del relato, no como adorno ni como integrantes.</w:t>
-      </w:r>
-    </w:p>
-    <w:p>
-      <w:pPr>
-        <w:pStyle w:val="Heading3"/>
-        <w:rPr>
-          <w:rFonts w:ascii="Calibri" w:eastAsia="Times New Roman" w:hAnsi="Calibri" w:cs="Calibri"/>
-          <w:lang w:val="es-ES"/>
-        </w:rPr>
-      </w:pPr>
-      <w:r>
-        <w:rPr>
-          <w:rFonts w:ascii="Calibri" w:eastAsia="Times New Roman" w:hAnsi="Calibri" w:cs="Calibri"/>
-          <w:lang w:val="es-ES"/>
-        </w:rPr>
-        <w:t>Qué me costó</w:t>
-      </w:r>
-    </w:p>
-    <w:p>
-      <w:pPr>
-        <w:pStyle w:val="NormalWeb"/>
-        <w:rPr>
-          <w:rFonts w:ascii="Calibri" w:hAnsi="Calibri" w:cs="Calibri"/>
-          <w:color w:val="222222"/>
-          <w:sz w:val="22"/>
-          <w:szCs w:val="22"/>
-          <w:lang w:val="es-ES"/>
-        </w:rPr>
-      </w:pPr>
-      <w:r>
-        <w:rPr>
-          <w:rFonts w:ascii="Calibri" w:hAnsi="Calibri" w:cs="Calibri"/>
-          <w:color w:val="222222"/>
-          <w:sz w:val="22"/>
-          <w:szCs w:val="22"/>
-          <w:lang w:val="es-ES"/>
-        </w:rPr>
-        <w:t xml:space="preserve">Separar el sistema de la evidencia académica, y separar mi rol del de los demás. El código no se sube “como esté”: hay carpetas, nombres </w:t>
-      </w:r>
-      <w:r>
-        <w:rPr>
-          <w:rFonts w:ascii="Calibri" w:hAnsi="Calibri" w:cs="Calibri"/>
-          <w:i/>
-          <w:iCs/>
-          <w:color w:val="222222"/>
-          <w:sz w:val="22"/>
-          <w:szCs w:val="22"/>
-          <w:lang w:val="es-ES"/>
-        </w:rPr>
-        <w:t>Apellido_Nombre_…</w:t>
-      </w:r>
-      <w:r>
-        <w:rPr>
-          <w:rFonts w:ascii="Calibri" w:hAnsi="Calibri" w:cs="Calibri"/>
-          <w:color w:val="222222"/>
-          <w:sz w:val="22"/>
-          <w:szCs w:val="22"/>
-          <w:lang w:val="es-ES"/>
-        </w:rPr>
-        <w:t xml:space="preserve"> y trazabilidad de quién hizo qué. También me costó no atribuirme pagos u operación del local, que la propuesta asigna a Benjamín, ni la visión de producto, que es de Joaquín.</w:t>
-      </w:r>
-    </w:p>
-    <w:p>
-      <w:pPr>
-        <w:pStyle w:val="Heading3"/>
-        <w:rPr>
-          <w:rFonts w:ascii="Calibri" w:eastAsia="Times New Roman" w:hAnsi="Calibri" w:cs="Calibri"/>
-          <w:lang w:val="es-ES"/>
-        </w:rPr>
-      </w:pPr>
-      <w:r>
-        <w:rPr>
-          <w:rFonts w:ascii="Calibri" w:eastAsia="Times New Roman" w:hAnsi="Calibri" w:cs="Calibri"/>
-          <w:lang w:val="es-ES"/>
-        </w:rPr>
-        <w:t>Cómo se ve el trabajo en equipo</w:t>
-      </w:r>
-    </w:p>
-    <w:p>
-      <w:pPr>
-        <w:pStyle w:val="NormalWeb"/>
-        <w:rPr>
-          <w:rFonts w:ascii="Calibri" w:hAnsi="Calibri" w:cs="Calibri"/>
-          <w:color w:val="222222"/>
-          <w:sz w:val="22"/>
-          <w:szCs w:val="22"/>
-          <w:lang w:val="es-ES"/>
-        </w:rPr>
-      </w:pPr>
-      <w:r>
-        <w:rPr>
-          <w:rFonts w:ascii="Calibri" w:hAnsi="Calibri" w:cs="Calibri"/>
-          <w:color w:val="222222"/>
-          <w:sz w:val="22"/>
-          <w:szCs w:val="22"/>
-          <w:lang w:val="es-ES"/>
-        </w:rPr>
-        <w:t>Como en la lámina 2: Joaquín, visión y priorización; yo, arquitectura y desarrollo; Benjamín, pagos, pedidos en línea y operación. Mitzi valida el local, no el repositorio. En Fase 2 eso tiene que verse en Git. La pauta pondera el aporte de cada integrante. Si el repo queda como si una sola persona hubiera hecho todo, el equipo se evalúa mal aunque el sistema funcione.</w:t>
-      </w:r>
-    </w:p>
-    <w:p>
-      <w:pPr>
-        <w:pStyle w:val="Heading3"/>
-        <w:rPr>
-          <w:rFonts w:ascii="Calibri" w:eastAsia="Times New Roman" w:hAnsi="Calibri" w:cs="Calibri"/>
-          <w:lang w:val="es-ES"/>
-        </w:rPr>
-      </w:pPr>
-      <w:r>
-        <w:rPr>
-          <w:rFonts w:ascii="Calibri" w:eastAsia="Times New Roman" w:hAnsi="Calibri" w:cs="Calibri"/>
-          <w:lang w:val="es-ES"/>
-        </w:rPr>
-        <w:t>Competencias que ejercí en estas semanas, desde mi rol</w:t>
+        <w:t>4. Síntesis, sin mezclar roles</w:t>
       </w:r>
     </w:p>
     <w:tbl>
@@ -2516,7 +1928,7 @@
                 <w:sz w:val="20"/>
                 <w:szCs w:val="20"/>
               </w:rPr>
-              <w:t>Competencia (perfil de egreso)</w:t>
+              <w:t>Tema</w:t>
             </w:r>
           </w:p>
         </w:tc>
@@ -2554,7 +1966,7 @@
                 <w:sz w:val="20"/>
                 <w:szCs w:val="20"/>
               </w:rPr>
-              <w:t>Cómo apareció, sin mezclar roles</w:t>
+              <w:t>Dueño</w:t>
             </w:r>
           </w:p>
         </w:tc>
@@ -2597,7 +2009,7 @@
                 <w:sz w:val="20"/>
                 <w:szCs w:val="20"/>
               </w:rPr>
-              <w:t>Propuesta de solución a partir de procesos reales</w:t>
+              <w:t>Visión incluir / cuidar / ordenar; PPT; sprints; recortes de relato</w:t>
             </w:r>
           </w:p>
         </w:tc>
@@ -2635,7 +2047,7 @@
                 <w:sz w:val="20"/>
                 <w:szCs w:val="20"/>
               </w:rPr>
-              <w:t>Del cuaderno a las tres puertas. Joaquín prioriza el problema; yo lo traduzco a arquitectura.</w:t>
+              <w:t>Joaquín Díaz</w:t>
             </w:r>
           </w:p>
         </w:tc>
@@ -2678,7 +2090,7 @@
                 <w:sz w:val="20"/>
                 <w:szCs w:val="20"/>
               </w:rPr>
-              <w:t>Modelo arquitectónico</w:t>
+              <w:t>Tres puertas, backend, modelo, escritorio, 2FA, git técnico</w:t>
             </w:r>
           </w:p>
         </w:tc>
@@ -2716,7 +2128,7 @@
                 <w:sz w:val="20"/>
                 <w:szCs w:val="20"/>
               </w:rPr>
-              <w:t>Web del cliente, POS del trabajador mayor, escritorio de Mitzi; admin fuera de la tablet; 2FA. Es el núcleo de mi rol.</w:t>
+              <w:t>Ariel Cariqueo</w:t>
             </w:r>
           </w:p>
         </w:tc>
@@ -2759,7 +2171,7 @@
                 <w:sz w:val="20"/>
                 <w:szCs w:val="20"/>
               </w:rPr>
-              <w:t>Seguridad de sistemas</w:t>
+              <w:t>TUU, Webpay, efectivo/vuelto, pedido en línea, pendientes/entregados, entrega</w:t>
             </w:r>
           </w:p>
         </w:tc>
@@ -2797,331 +2209,7 @@
                 <w:sz w:val="20"/>
                 <w:szCs w:val="20"/>
               </w:rPr>
-              <w:t>Authenticator en la puerta de administración; retiro con nombre y teléfono. Se descarta WhatsApp.</w:t>
-            </w:r>
-          </w:p>
-        </w:tc>
-      </w:tr>
-      <w:tr>
-        <w:trPr>
-          <w:cantSplit/>
-        </w:trPr>
-        <w:tc>
-          <w:tcPr>
-            <w:tcW w:w="0" w:type="auto"/>
-            <w:tcBorders>
-              <w:top w:val="single" w:sz="6" w:space="0" w:color="8FAADC"/>
-              <w:left w:val="single" w:sz="6" w:space="0" w:color="8FAADC"/>
-              <w:bottom w:val="single" w:sz="6" w:space="0" w:color="8FAADC"/>
-              <w:right w:val="single" w:sz="6" w:space="0" w:color="8FAADC"/>
-            </w:tcBorders>
-            <w:tcMar>
-              <w:top w:w="100" w:type="dxa"/>
-              <w:left w:w="120" w:type="dxa"/>
-              <w:bottom w:w="100" w:type="dxa"/>
-              <w:right w:w="120" w:type="dxa"/>
-            </w:tcMar>
-            <w:hideMark/>
-          </w:tcPr>
-          <w:p>
-            <w:pPr>
-              <w:spacing w:before="160" w:after="240"/>
-              <w:rPr>
-                <w:rFonts w:ascii="Calibri" w:eastAsia="Times New Roman" w:hAnsi="Calibri" w:cs="Calibri"/>
-                <w:color w:val="222222"/>
-                <w:sz w:val="20"/>
-                <w:szCs w:val="20"/>
-              </w:rPr>
-            </w:pPr>
-            <w:r>
-              <w:rPr>
-                <w:rFonts w:ascii="Calibri" w:eastAsia="Times New Roman" w:hAnsi="Calibri" w:cs="Calibri"/>
-                <w:color w:val="222222"/>
-                <w:sz w:val="20"/>
-                <w:szCs w:val="20"/>
-              </w:rPr>
-              <w:t>Gestión de proyecto / alternativas de decisión</w:t>
-            </w:r>
-          </w:p>
-        </w:tc>
-        <w:tc>
-          <w:tcPr>
-            <w:tcW w:w="0" w:type="auto"/>
-            <w:tcBorders>
-              <w:top w:val="single" w:sz="6" w:space="0" w:color="8FAADC"/>
-              <w:left w:val="single" w:sz="6" w:space="0" w:color="8FAADC"/>
-              <w:bottom w:val="single" w:sz="6" w:space="0" w:color="8FAADC"/>
-              <w:right w:val="single" w:sz="6" w:space="0" w:color="8FAADC"/>
-            </w:tcBorders>
-            <w:tcMar>
-              <w:top w:w="100" w:type="dxa"/>
-              <w:left w:w="120" w:type="dxa"/>
-              <w:bottom w:w="100" w:type="dxa"/>
-              <w:right w:w="120" w:type="dxa"/>
-            </w:tcMar>
-            <w:hideMark/>
-          </w:tcPr>
-          <w:p>
-            <w:pPr>
-              <w:spacing w:before="160" w:after="240"/>
-              <w:rPr>
-                <w:rFonts w:ascii="Calibri" w:eastAsia="Times New Roman" w:hAnsi="Calibri" w:cs="Calibri"/>
-                <w:color w:val="222222"/>
-                <w:sz w:val="20"/>
-                <w:szCs w:val="20"/>
-              </w:rPr>
-            </w:pPr>
-            <w:r>
-              <w:rPr>
-                <w:rFonts w:ascii="Calibri" w:eastAsia="Times New Roman" w:hAnsi="Calibri" w:cs="Calibri"/>
-                <w:color w:val="222222"/>
-                <w:sz w:val="20"/>
-                <w:szCs w:val="20"/>
-              </w:rPr>
-              <w:t>Joaquín lidera. Yo ofrezco alternativas técnicas (escritorio versus web, ágil versus Waterfall) y sus costos.</w:t>
-            </w:r>
-          </w:p>
-        </w:tc>
-      </w:tr>
-      <w:tr>
-        <w:trPr>
-          <w:cantSplit/>
-        </w:trPr>
-        <w:tc>
-          <w:tcPr>
-            <w:tcW w:w="0" w:type="auto"/>
-            <w:tcBorders>
-              <w:top w:val="single" w:sz="6" w:space="0" w:color="8FAADC"/>
-              <w:left w:val="single" w:sz="6" w:space="0" w:color="8FAADC"/>
-              <w:bottom w:val="single" w:sz="6" w:space="0" w:color="8FAADC"/>
-              <w:right w:val="single" w:sz="6" w:space="0" w:color="8FAADC"/>
-            </w:tcBorders>
-            <w:tcMar>
-              <w:top w:w="100" w:type="dxa"/>
-              <w:left w:w="120" w:type="dxa"/>
-              <w:bottom w:w="100" w:type="dxa"/>
-              <w:right w:w="120" w:type="dxa"/>
-            </w:tcMar>
-            <w:hideMark/>
-          </w:tcPr>
-          <w:p>
-            <w:pPr>
-              <w:spacing w:before="160" w:after="240"/>
-              <w:rPr>
-                <w:rFonts w:ascii="Calibri" w:eastAsia="Times New Roman" w:hAnsi="Calibri" w:cs="Calibri"/>
-                <w:color w:val="222222"/>
-                <w:sz w:val="20"/>
-                <w:szCs w:val="20"/>
-              </w:rPr>
-            </w:pPr>
-            <w:r>
-              <w:rPr>
-                <w:rFonts w:ascii="Calibri" w:eastAsia="Times New Roman" w:hAnsi="Calibri" w:cs="Calibri"/>
-                <w:color w:val="222222"/>
-                <w:sz w:val="20"/>
-                <w:szCs w:val="20"/>
-              </w:rPr>
-              <w:t>Integración de sistemas</w:t>
-            </w:r>
-          </w:p>
-        </w:tc>
-        <w:tc>
-          <w:tcPr>
-            <w:tcW w:w="0" w:type="auto"/>
-            <w:tcBorders>
-              <w:top w:val="single" w:sz="6" w:space="0" w:color="8FAADC"/>
-              <w:left w:val="single" w:sz="6" w:space="0" w:color="8FAADC"/>
-              <w:bottom w:val="single" w:sz="6" w:space="0" w:color="8FAADC"/>
-              <w:right w:val="single" w:sz="6" w:space="0" w:color="8FAADC"/>
-            </w:tcBorders>
-            <w:tcMar>
-              <w:top w:w="100" w:type="dxa"/>
-              <w:left w:w="120" w:type="dxa"/>
-              <w:bottom w:w="100" w:type="dxa"/>
-              <w:right w:w="120" w:type="dxa"/>
-            </w:tcMar>
-            <w:hideMark/>
-          </w:tcPr>
-          <w:p>
-            <w:pPr>
-              <w:spacing w:before="160" w:after="240"/>
-              <w:rPr>
-                <w:rFonts w:ascii="Calibri" w:eastAsia="Times New Roman" w:hAnsi="Calibri" w:cs="Calibri"/>
-                <w:color w:val="222222"/>
-                <w:sz w:val="20"/>
-                <w:szCs w:val="20"/>
-              </w:rPr>
-            </w:pPr>
-            <w:r>
-              <w:rPr>
-                <w:rFonts w:ascii="Calibri" w:eastAsia="Times New Roman" w:hAnsi="Calibri" w:cs="Calibri"/>
-                <w:color w:val="222222"/>
-                <w:sz w:val="20"/>
-                <w:szCs w:val="20"/>
-              </w:rPr>
-              <w:t>El backend deja contratos para pagos y pedidos. La integración de TUU, Webpay y la operación del mostrador es de Benjamín.</w:t>
-            </w:r>
-          </w:p>
-        </w:tc>
-      </w:tr>
-      <w:tr>
-        <w:trPr>
-          <w:cantSplit/>
-        </w:trPr>
-        <w:tc>
-          <w:tcPr>
-            <w:tcW w:w="0" w:type="auto"/>
-            <w:tcBorders>
-              <w:top w:val="single" w:sz="6" w:space="0" w:color="8FAADC"/>
-              <w:left w:val="single" w:sz="6" w:space="0" w:color="8FAADC"/>
-              <w:bottom w:val="single" w:sz="6" w:space="0" w:color="8FAADC"/>
-              <w:right w:val="single" w:sz="6" w:space="0" w:color="8FAADC"/>
-            </w:tcBorders>
-            <w:tcMar>
-              <w:top w:w="100" w:type="dxa"/>
-              <w:left w:w="120" w:type="dxa"/>
-              <w:bottom w:w="100" w:type="dxa"/>
-              <w:right w:w="120" w:type="dxa"/>
-            </w:tcMar>
-            <w:hideMark/>
-          </w:tcPr>
-          <w:p>
-            <w:pPr>
-              <w:spacing w:before="160" w:after="240"/>
-              <w:rPr>
-                <w:rFonts w:ascii="Calibri" w:eastAsia="Times New Roman" w:hAnsi="Calibri" w:cs="Calibri"/>
-                <w:color w:val="222222"/>
-                <w:sz w:val="20"/>
-                <w:szCs w:val="20"/>
-              </w:rPr>
-            </w:pPr>
-            <w:r>
-              <w:rPr>
-                <w:rFonts w:ascii="Calibri" w:eastAsia="Times New Roman" w:hAnsi="Calibri" w:cs="Calibri"/>
-                <w:color w:val="222222"/>
-                <w:sz w:val="20"/>
-                <w:szCs w:val="20"/>
-              </w:rPr>
-              <w:t>Comunicación profesional</w:t>
-            </w:r>
-          </w:p>
-        </w:tc>
-        <w:tc>
-          <w:tcPr>
-            <w:tcW w:w="0" w:type="auto"/>
-            <w:tcBorders>
-              <w:top w:val="single" w:sz="6" w:space="0" w:color="8FAADC"/>
-              <w:left w:val="single" w:sz="6" w:space="0" w:color="8FAADC"/>
-              <w:bottom w:val="single" w:sz="6" w:space="0" w:color="8FAADC"/>
-              <w:right w:val="single" w:sz="6" w:space="0" w:color="8FAADC"/>
-            </w:tcBorders>
-            <w:tcMar>
-              <w:top w:w="100" w:type="dxa"/>
-              <w:left w:w="120" w:type="dxa"/>
-              <w:bottom w:w="100" w:type="dxa"/>
-              <w:right w:w="120" w:type="dxa"/>
-            </w:tcMar>
-            <w:hideMark/>
-          </w:tcPr>
-          <w:p>
-            <w:pPr>
-              <w:spacing w:before="160" w:after="240"/>
-              <w:rPr>
-                <w:rFonts w:ascii="Calibri" w:eastAsia="Times New Roman" w:hAnsi="Calibri" w:cs="Calibri"/>
-                <w:color w:val="222222"/>
-                <w:sz w:val="20"/>
-                <w:szCs w:val="20"/>
-              </w:rPr>
-            </w:pPr>
-            <w:r>
-              <w:rPr>
-                <w:rFonts w:ascii="Calibri" w:eastAsia="Times New Roman" w:hAnsi="Calibri" w:cs="Calibri"/>
-                <w:color w:val="222222"/>
-                <w:sz w:val="20"/>
-                <w:szCs w:val="20"/>
-              </w:rPr>
-              <w:t>Propuesta en lenguaje de producto (incluir, cuidar, ordenar); corrección del relato y de quién es integrante.</w:t>
-            </w:r>
-          </w:p>
-        </w:tc>
-      </w:tr>
-      <w:tr>
-        <w:trPr>
-          <w:cantSplit/>
-        </w:trPr>
-        <w:tc>
-          <w:tcPr>
-            <w:tcW w:w="0" w:type="auto"/>
-            <w:tcBorders>
-              <w:top w:val="single" w:sz="6" w:space="0" w:color="8FAADC"/>
-              <w:left w:val="single" w:sz="6" w:space="0" w:color="8FAADC"/>
-              <w:bottom w:val="single" w:sz="6" w:space="0" w:color="8FAADC"/>
-              <w:right w:val="single" w:sz="6" w:space="0" w:color="8FAADC"/>
-            </w:tcBorders>
-            <w:tcMar>
-              <w:top w:w="100" w:type="dxa"/>
-              <w:left w:w="120" w:type="dxa"/>
-              <w:bottom w:w="100" w:type="dxa"/>
-              <w:right w:w="120" w:type="dxa"/>
-            </w:tcMar>
-            <w:hideMark/>
-          </w:tcPr>
-          <w:p>
-            <w:pPr>
-              <w:spacing w:before="160" w:after="240"/>
-              <w:rPr>
-                <w:rFonts w:ascii="Calibri" w:eastAsia="Times New Roman" w:hAnsi="Calibri" w:cs="Calibri"/>
-                <w:color w:val="222222"/>
-                <w:sz w:val="20"/>
-                <w:szCs w:val="20"/>
-              </w:rPr>
-            </w:pPr>
-            <w:r>
-              <w:rPr>
-                <w:rFonts w:ascii="Calibri" w:eastAsia="Times New Roman" w:hAnsi="Calibri" w:cs="Calibri"/>
-                <w:color w:val="222222"/>
-                <w:sz w:val="20"/>
-                <w:szCs w:val="20"/>
-              </w:rPr>
-              <w:t>Trabajo en equipo</w:t>
-            </w:r>
-          </w:p>
-        </w:tc>
-        <w:tc>
-          <w:tcPr>
-            <w:tcW w:w="0" w:type="auto"/>
-            <w:tcBorders>
-              <w:top w:val="single" w:sz="6" w:space="0" w:color="8FAADC"/>
-              <w:left w:val="single" w:sz="6" w:space="0" w:color="8FAADC"/>
-              <w:bottom w:val="single" w:sz="6" w:space="0" w:color="8FAADC"/>
-              <w:right w:val="single" w:sz="6" w:space="0" w:color="8FAADC"/>
-            </w:tcBorders>
-            <w:tcMar>
-              <w:top w:w="100" w:type="dxa"/>
-              <w:left w:w="120" w:type="dxa"/>
-              <w:bottom w:w="100" w:type="dxa"/>
-              <w:right w:w="120" w:type="dxa"/>
-            </w:tcMar>
-            <w:hideMark/>
-          </w:tcPr>
-          <w:p>
-            <w:pPr>
-              <w:spacing w:before="160" w:after="240"/>
-              <w:rPr>
-                <w:rFonts w:ascii="Calibri" w:eastAsia="Times New Roman" w:hAnsi="Calibri" w:cs="Calibri"/>
-                <w:color w:val="222222"/>
-                <w:sz w:val="20"/>
-                <w:szCs w:val="20"/>
-              </w:rPr>
-            </w:pPr>
-            <w:r>
-              <w:rPr>
-                <w:rFonts w:ascii="Calibri" w:eastAsia="Times New Roman" w:hAnsi="Calibri" w:cs="Calibri"/>
-                <w:color w:val="222222"/>
-                <w:sz w:val="20"/>
-                <w:szCs w:val="20"/>
-              </w:rPr>
-              <w:t>Tres roles distintos, contraparte no técnica (Mitzi) y usuario del POS que no somos nosotros.</w:t>
+              <w:t>Benjamín Repetto</w:t>
             </w:r>
           </w:p>
         </w:tc>
@@ -3129,18 +2217,46 @@
     </w:tbl>
     <w:p>
       <w:pPr>
-        <w:pStyle w:val="Heading2"/>
-        <w:rPr>
-          <w:rFonts w:ascii="Calibri" w:eastAsia="Times New Roman" w:hAnsi="Calibri" w:cs="Calibri"/>
+        <w:pStyle w:val="NormalWeb"/>
+        <w:rPr>
+          <w:rFonts w:ascii="Calibri" w:hAnsi="Calibri" w:cs="Calibri"/>
+          <w:color w:val="222222"/>
+          <w:sz w:val="22"/>
+          <w:szCs w:val="22"/>
           <w:lang w:val="es-ES"/>
         </w:rPr>
       </w:pPr>
       <w:r>
         <w:rPr>
-          <w:rFonts w:ascii="Calibri" w:eastAsia="Times New Roman" w:hAnsi="Calibri" w:cs="Calibri"/>
-          <w:lang w:val="es-ES"/>
-        </w:rPr>
-        <w:t>6. Relación con mis intereses profesionales</w:t>
+          <w:rFonts w:ascii="Calibri" w:hAnsi="Calibri" w:cs="Calibri"/>
+          <w:b/>
+          <w:bCs/>
+          <w:color w:val="222222"/>
+          <w:sz w:val="22"/>
+          <w:szCs w:val="22"/>
+          <w:lang w:val="es-ES"/>
+        </w:rPr>
+        <w:t>Qué me costó.</w:t>
+      </w:r>
+      <w:r>
+        <w:rPr>
+          <w:rFonts w:ascii="Calibri" w:hAnsi="Calibri" w:cs="Calibri"/>
+          <w:color w:val="222222"/>
+          <w:sz w:val="22"/>
+          <w:szCs w:val="22"/>
+          <w:lang w:val="es-ES"/>
+        </w:rPr>
+        <w:t xml:space="preserve"> </w:t>
+      </w:r>
+      <w:r>
+        <w:rPr>
+          <w:rFonts w:ascii="Calibri" w:hAnsi="Calibri" w:cs="Calibri"/>
+          <w:color w:val="222222"/>
+          <w:sz w:val="22"/>
+          <w:szCs w:val="22"/>
+          <w:lang w:val="es-ES"/>
+        </w:rPr>
+        <w:t>Soltar cosas que yo había programado o ajustado (listas del POS, filtros) y reconocer que operativamente son de Benjamín. Soltar la historia del producto, que es de Joaquín.</w:t>
       </w:r>
     </w:p>
     <w:p>
@@ -3157,22 +2273,24 @@
       <w:r>
         <w:rPr>
           <w:rFonts w:ascii="Calibri" w:hAnsi="Calibri" w:cs="Calibri"/>
-          <w:color w:val="222222"/>
-          <w:sz w:val="22"/>
-          <w:szCs w:val="22"/>
-          <w:lang w:val="es-ES"/>
-        </w:rPr>
-        <w:t>Al cerrar Fase 1 puedo decir con más precisión qué me interesa, y coincide con el rol de la propuesta. Me interesa diseñar la forma de un sistema: quién entra, qué ve, qué datos se piden, qué queda fuera por seguridad. Me interesa el desarrollo cuando está al servicio de un usuario que no va a leer un manual —el trabajador mayor en un POS táctil— y de una dueña que necesita reportes, no otra pantalla más. Los pagos chilenos y la operación del local importan, pero no son “mi lámina”: trabajo con Benjamín par</w:t>
-      </w:r>
-      <w:r>
-        <w:rPr>
-          <w:rFonts w:ascii="Calibri" w:hAnsi="Calibri" w:cs="Calibri"/>
-          <w:color w:val="222222"/>
-          <w:sz w:val="22"/>
-          <w:szCs w:val="22"/>
-          <w:lang w:val="es-ES"/>
-        </w:rPr>
-        <w:t>a que esas integraciones entren en la arquitectura, no para reemplazarlo.</w:t>
+          <w:b/>
+          <w:bCs/>
+          <w:color w:val="222222"/>
+          <w:sz w:val="22"/>
+          <w:szCs w:val="22"/>
+          <w:lang w:val="es-ES"/>
+        </w:rPr>
+        <w:t>Qué haré en Fase 2.</w:t>
+      </w:r>
+      <w:r>
+        <w:rPr>
+          <w:rFonts w:ascii="Calibri" w:hAnsi="Calibri" w:cs="Calibri"/>
+          <w:color w:val="222222"/>
+          <w:sz w:val="22"/>
+          <w:szCs w:val="22"/>
+          <w:lang w:val="es-ES"/>
+        </w:rPr>
+        <w:t xml:space="preserve"> Commits de arquitectura, backend, frontend de cascarón y escritorio a mi nombre. Contratos de API documentados para Benjamín. No reabrir el backlog. Casos de prueba míos: 2FA, stock, sync. No firmar yo los de TUU ni Webpay.</w:t>
       </w:r>
     </w:p>
     <w:p>
@@ -3194,283 +2312,7 @@
           <w:szCs w:val="22"/>
           <w:lang w:val="es-ES"/>
         </w:rPr>
-        <w:t>Eso se alinea con el campo laboral del perfil de egreso: analizar, diseñar, desarrollar, implementar y gestionar proyectos informáticos, velando por seguridad y calidad. La 200 es esa analogía a escala de un local de parcelación.</w:t>
-      </w:r>
-    </w:p>
-    <w:p>
-      <w:pPr>
-        <w:pStyle w:val="Heading2"/>
-        <w:rPr>
-          <w:rFonts w:ascii="Calibri" w:eastAsia="Times New Roman" w:hAnsi="Calibri" w:cs="Calibri"/>
-          <w:lang w:val="es-ES"/>
-        </w:rPr>
-      </w:pPr>
-      <w:r>
-        <w:rPr>
-          <w:rFonts w:ascii="Calibri" w:eastAsia="Times New Roman" w:hAnsi="Calibri" w:cs="Calibri"/>
-          <w:lang w:val="es-ES"/>
-        </w:rPr>
-        <w:t>7. Qué haré distinto en Fase 2</w:t>
-      </w:r>
-    </w:p>
-    <w:p>
-      <w:pPr>
-        <w:pStyle w:val="NormalWeb"/>
-        <w:rPr>
-          <w:rFonts w:ascii="Calibri" w:hAnsi="Calibri" w:cs="Calibri"/>
-          <w:color w:val="222222"/>
-          <w:sz w:val="22"/>
-          <w:szCs w:val="22"/>
-          <w:lang w:val="es-ES"/>
-        </w:rPr>
-      </w:pPr>
-      <w:r>
-        <w:rPr>
-          <w:rFonts w:ascii="Calibri" w:hAnsi="Calibri" w:cs="Calibri"/>
-          <w:b/>
-          <w:bCs/>
-          <w:color w:val="222222"/>
-          <w:sz w:val="22"/>
-          <w:szCs w:val="22"/>
-          <w:lang w:val="es-ES"/>
-        </w:rPr>
-        <w:t>1. Evidencia con el formato pedido y con mi rol.</w:t>
-      </w:r>
-      <w:r>
-        <w:rPr>
-          <w:rFonts w:ascii="Calibri" w:hAnsi="Calibri" w:cs="Calibri"/>
-          <w:color w:val="222222"/>
-          <w:sz w:val="22"/>
-          <w:szCs w:val="22"/>
-          <w:lang w:val="es-ES"/>
-        </w:rPr>
-        <w:t xml:space="preserve"> Archivos </w:t>
-      </w:r>
-      <w:r>
-        <w:rPr>
-          <w:rFonts w:ascii="Calibri" w:hAnsi="Calibri" w:cs="Calibri"/>
-          <w:i/>
-          <w:iCs/>
-          <w:color w:val="222222"/>
-          <w:sz w:val="22"/>
-          <w:szCs w:val="22"/>
-          <w:lang w:val="es-ES"/>
-        </w:rPr>
-        <w:t>Cariqueo_Ariel_…</w:t>
-      </w:r>
-      <w:r>
-        <w:rPr>
-          <w:rFonts w:ascii="Calibri" w:hAnsi="Calibri" w:cs="Calibri"/>
-          <w:color w:val="222222"/>
-          <w:sz w:val="22"/>
-          <w:szCs w:val="22"/>
-          <w:lang w:val="es-ES"/>
-        </w:rPr>
-        <w:t>, carpeta Evidencias Individuales, commits de arquitectura, backend, frontend y escritorio. Lo de pagos y operación, que quede a nombre de Benjamín; la priorización, en la coordinación de Joaquín.</w:t>
-      </w:r>
-    </w:p>
-    <w:p>
-      <w:pPr>
-        <w:pStyle w:val="NormalWeb"/>
-        <w:rPr>
-          <w:rFonts w:ascii="Calibri" w:hAnsi="Calibri" w:cs="Calibri"/>
-          <w:color w:val="222222"/>
-          <w:sz w:val="22"/>
-          <w:szCs w:val="22"/>
-          <w:lang w:val="es-ES"/>
-        </w:rPr>
-      </w:pPr>
-      <w:r>
-        <w:rPr>
-          <w:rFonts w:ascii="Calibri" w:hAnsi="Calibri" w:cs="Calibri"/>
-          <w:b/>
-          <w:bCs/>
-          <w:color w:val="222222"/>
-          <w:sz w:val="22"/>
-          <w:szCs w:val="22"/>
-          <w:lang w:val="es-ES"/>
-        </w:rPr>
-        <w:t>2. Documentar datos y pruebas de las tres puertas.</w:t>
-      </w:r>
-      <w:r>
-        <w:rPr>
-          <w:rFonts w:ascii="Calibri" w:hAnsi="Calibri" w:cs="Calibri"/>
-          <w:color w:val="222222"/>
-          <w:sz w:val="22"/>
-          <w:szCs w:val="22"/>
-          <w:lang w:val="es-ES"/>
-        </w:rPr>
-        <w:t xml:space="preserve"> Modelo de datos, casos de retiro, stock y 2FA. Coordinar con Benjamín los casos de TUU y Webpay.</w:t>
-      </w:r>
-    </w:p>
-    <w:p>
-      <w:pPr>
-        <w:pStyle w:val="NormalWeb"/>
-        <w:rPr>
-          <w:rFonts w:ascii="Calibri" w:hAnsi="Calibri" w:cs="Calibri"/>
-          <w:color w:val="222222"/>
-          <w:sz w:val="22"/>
-          <w:szCs w:val="22"/>
-          <w:lang w:val="es-ES"/>
-        </w:rPr>
-      </w:pPr>
-      <w:r>
-        <w:rPr>
-          <w:rFonts w:ascii="Calibri" w:hAnsi="Calibri" w:cs="Calibri"/>
-          <w:b/>
-          <w:bCs/>
-          <w:color w:val="222222"/>
-          <w:sz w:val="22"/>
-          <w:szCs w:val="22"/>
-          <w:lang w:val="es-ES"/>
-        </w:rPr>
-        <w:t>3. Probar con el criterio de la propuesta.</w:t>
-      </w:r>
-      <w:r>
-        <w:rPr>
-          <w:rFonts w:ascii="Calibri" w:hAnsi="Calibri" w:cs="Calibri"/>
-          <w:color w:val="222222"/>
-          <w:sz w:val="22"/>
-          <w:szCs w:val="22"/>
-          <w:lang w:val="es-ES"/>
-        </w:rPr>
-        <w:t xml:space="preserve"> </w:t>
-      </w:r>
-      <w:r>
-        <w:rPr>
-          <w:rFonts w:ascii="Calibri" w:hAnsi="Calibri" w:cs="Calibri"/>
-          <w:color w:val="222222"/>
-          <w:sz w:val="22"/>
-          <w:szCs w:val="22"/>
-          <w:lang w:val="es-ES"/>
-        </w:rPr>
-        <w:t>El POS se evalúa con un trabajador mayor (o un flujo que lo simule), no solo con el equipo. Mitzi ve el escritorio, no la tablet de venta.</w:t>
-      </w:r>
-    </w:p>
-    <w:p>
-      <w:pPr>
-        <w:pStyle w:val="NormalWeb"/>
-        <w:rPr>
-          <w:rFonts w:ascii="Calibri" w:hAnsi="Calibri" w:cs="Calibri"/>
-          <w:color w:val="222222"/>
-          <w:sz w:val="22"/>
-          <w:szCs w:val="22"/>
-          <w:lang w:val="es-ES"/>
-        </w:rPr>
-      </w:pPr>
-      <w:r>
-        <w:rPr>
-          <w:rFonts w:ascii="Calibri" w:hAnsi="Calibri" w:cs="Calibri"/>
-          <w:b/>
-          <w:bCs/>
-          <w:color w:val="222222"/>
-          <w:sz w:val="22"/>
-          <w:szCs w:val="22"/>
-          <w:lang w:val="es-ES"/>
-        </w:rPr>
-        <w:t>4. No reabrir decisiones ya cerradas</w:t>
-      </w:r>
-      <w:r>
-        <w:rPr>
-          <w:rFonts w:ascii="Calibri" w:hAnsi="Calibri" w:cs="Calibri"/>
-          <w:color w:val="222222"/>
-          <w:sz w:val="22"/>
-          <w:szCs w:val="22"/>
-          <w:lang w:val="es-ES"/>
-        </w:rPr>
-        <w:t xml:space="preserve"> (WhatsApp, admin en la web, kiosco, bebidas, Mitzi como integrante) salvo que el local demuestre que hay que cambiarlas. Eso es priorización de Joaquín y diseño mío, juntos.</w:t>
-      </w:r>
-    </w:p>
-    <w:p>
-      <w:pPr>
-        <w:pStyle w:val="NormalWeb"/>
-        <w:rPr>
-          <w:rFonts w:ascii="Calibri" w:hAnsi="Calibri" w:cs="Calibri"/>
-          <w:color w:val="222222"/>
-          <w:sz w:val="22"/>
-          <w:szCs w:val="22"/>
-          <w:lang w:val="es-ES"/>
-        </w:rPr>
-      </w:pPr>
-      <w:r>
-        <w:rPr>
-          <w:rFonts w:ascii="Calibri" w:hAnsi="Calibri" w:cs="Calibri"/>
-          <w:b/>
-          <w:bCs/>
-          <w:color w:val="222222"/>
-          <w:sz w:val="22"/>
-          <w:szCs w:val="22"/>
-          <w:lang w:val="es-ES"/>
-        </w:rPr>
-        <w:t>5. Visibilizar el aporte de cada integrante.</w:t>
-      </w:r>
-      <w:r>
-        <w:rPr>
-          <w:rFonts w:ascii="Calibri" w:hAnsi="Calibri" w:cs="Calibri"/>
-          <w:color w:val="222222"/>
-          <w:sz w:val="22"/>
-          <w:szCs w:val="22"/>
-          <w:lang w:val="es-ES"/>
-        </w:rPr>
-        <w:t xml:space="preserve"> </w:t>
-      </w:r>
-      <w:r>
-        <w:rPr>
-          <w:rFonts w:ascii="Calibri" w:hAnsi="Calibri" w:cs="Calibri"/>
-          <w:color w:val="222222"/>
-          <w:sz w:val="22"/>
-          <w:szCs w:val="22"/>
-          <w:lang w:val="es-ES"/>
-        </w:rPr>
-        <w:t>Equidad de trabajo no se declara: se ve en el repositorio y en las evidencias de sistema (aplicación y base de datos).</w:t>
-      </w:r>
-    </w:p>
-    <w:p>
-      <w:pPr>
-        <w:pStyle w:val="Heading2"/>
-        <w:rPr>
-          <w:rFonts w:ascii="Calibri" w:eastAsia="Times New Roman" w:hAnsi="Calibri" w:cs="Calibri"/>
-          <w:lang w:val="es-ES"/>
-        </w:rPr>
-      </w:pPr>
-      <w:r>
-        <w:rPr>
-          <w:rFonts w:ascii="Calibri" w:eastAsia="Times New Roman" w:hAnsi="Calibri" w:cs="Calibri"/>
-          <w:lang w:val="es-ES"/>
-        </w:rPr>
-        <w:t>8. Cierre</w:t>
-      </w:r>
-    </w:p>
-    <w:p>
-      <w:pPr>
-        <w:pStyle w:val="NormalWeb"/>
-        <w:rPr>
-          <w:rFonts w:ascii="Calibri" w:hAnsi="Calibri" w:cs="Calibri"/>
-          <w:color w:val="222222"/>
-          <w:sz w:val="22"/>
-          <w:szCs w:val="22"/>
-          <w:lang w:val="es-ES"/>
-        </w:rPr>
-      </w:pPr>
-      <w:r>
-        <w:rPr>
-          <w:rFonts w:ascii="Calibri" w:hAnsi="Calibri" w:cs="Calibri"/>
-          <w:color w:val="222222"/>
-          <w:sz w:val="22"/>
-          <w:szCs w:val="22"/>
-          <w:lang w:val="es-ES"/>
-        </w:rPr>
-        <w:t xml:space="preserve">Fase 1 me dejó un proyecto que puedo defender en los términos de la propuesta: problema, usuarios, tres puertas y un plan ágil. También me dejó claro dónde no estoy aún al nivel de titulación: pruebas formales, documentación de datos y evidencias de Git con formato. Y me dejó un límite sano: no soy el jefe de proyecto ni el de las integraciones de pago. Soy arquitectura y desarrollo. Si esta fase se resume como la propuesta, es esta: el local sigue siendo de la parcelación; la tecnología, por fin, también. </w:t>
-      </w:r>
-      <w:r>
-        <w:rPr>
-          <w:rFonts w:ascii="Calibri" w:hAnsi="Calibri" w:cs="Calibri"/>
-          <w:color w:val="222222"/>
-          <w:sz w:val="22"/>
-          <w:szCs w:val="22"/>
-          <w:lang w:val="es-ES"/>
-        </w:rPr>
-        <w:t>Incluir a quien atiende. Cuidar a quien compra. Ordenar el negocio.</w:t>
+        <w:t>Cierre: soy arquitectura y desarrollo. No soy jefe de proyecto. No soy integraciones de pago ni operación del local. Si el repo o este diario dicen otra cosa, está mal.</w:t>
       </w:r>
     </w:p>
     <w:tbl>
@@ -3490,7 +2332,7 @@
       </w:tblGrid>
       <w:tr>
         <w:trPr>
-          <w:divId w:val="1400128496"/>
+          <w:divId w:val="1047604904"/>
           <w:cantSplit/>
         </w:trPr>
         <w:tc>
@@ -3572,7 +2414,7 @@
       </w:tr>
       <w:tr>
         <w:trPr>
-          <w:divId w:val="1400128496"/>
+          <w:divId w:val="1047604904"/>
           <w:cantSplit/>
         </w:trPr>
         <w:tc>
@@ -3609,7 +2451,7 @@
                 <w:sz w:val="20"/>
                 <w:szCs w:val="20"/>
               </w:rPr>
-              <w:t>Rol en la propuesta</w:t>
+              <w:t>Rol</w:t>
             </w:r>
           </w:p>
         </w:tc>
@@ -3647,14 +2489,14 @@
                 <w:sz w:val="20"/>
                 <w:szCs w:val="20"/>
               </w:rPr>
-              <w:t>Arquitectura y desarrollo — diseño técnico, backend, frontend y app de escritorio</w:t>
+              <w:t>Arquitectura y desarrollo</w:t>
             </w:r>
           </w:p>
         </w:tc>
       </w:tr>
       <w:tr>
         <w:trPr>
-          <w:divId w:val="1400128496"/>
+          <w:divId w:val="1047604904"/>
           <w:cantSplit/>
         </w:trPr>
         <w:tc>
@@ -3691,7 +2533,7 @@
                 <w:sz w:val="20"/>
                 <w:szCs w:val="20"/>
               </w:rPr>
-              <w:t>Equipo de título</w:t>
+              <w:t>Equipo</w:t>
             </w:r>
           </w:p>
         </w:tc>
@@ -3729,14 +2571,14 @@
                 <w:sz w:val="20"/>
                 <w:szCs w:val="20"/>
               </w:rPr>
-              <w:t>Joaquín Díaz (jefe de proyecto); Ariel Cariqueo; Benjamín Repetto (desarrollo e integraciones)</w:t>
+              <w:t>Joaquín Díaz (jefe de proyecto); Benjamín Repetto (desarrollo e integraciones)</w:t>
             </w:r>
           </w:p>
         </w:tc>
       </w:tr>
       <w:tr>
         <w:trPr>
-          <w:divId w:val="1400128496"/>
+          <w:divId w:val="1047604904"/>
           <w:cantSplit/>
         </w:trPr>
         <w:tc>
@@ -3818,7 +2660,7 @@
       </w:tr>
       <w:tr>
         <w:trPr>
-          <w:divId w:val="1400128496"/>
+          <w:divId w:val="1047604904"/>
           <w:cantSplit/>
         </w:trPr>
         <w:tc>
@@ -3903,7 +2745,7 @@
       <w:pPr>
         <w:pStyle w:val="small"/>
         <w:spacing w:before="0" w:beforeAutospacing="0" w:after="160" w:afterAutospacing="0"/>
-        <w:divId w:val="1400128496"/>
+        <w:divId w:val="1047604904"/>
         <w:rPr>
           <w:rFonts w:ascii="Calibri" w:hAnsi="Calibri" w:cs="Calibri"/>
           <w:sz w:val="18"/>
@@ -3916,7 +2758,7 @@
           <w:sz w:val="18"/>
           <w:lang w:val="es-ES"/>
         </w:rPr>
-        <w:t>Documento individual Fase 1. Nombre de archivo según formato institucional: Cariqueo_Ariel_1.2_APT122_DiarioReflexionFase1.docx — carpeta Evidencias Individuales.</w:t>
+        <w:t>Documento individual Fase 1. Cariqueo_Ariel_1.2_APT122_DiarioReflexionFase1.docx — Evidencias Individuales.</w:t>
       </w:r>
     </w:p>
     <w:sectPr>
@@ -3927,7 +2769,7 @@
       <w:headerReference w:type="first" r:id="rId10"/>
       <w:footerReference w:type="first" r:id="rId11"/>
       <w:pgSz w:w="11907" w:h="16839"/>
-      <w:pgMar w:top="1134" w:right="1247" w:bottom="1134" w:left="1247" w:header="567" w:footer="567" w:gutter="0"/>
+      <w:pgMar w:top="1134" w:right="1247" w:bottom="1134" w:left="1247" w:header="720" w:footer="720" w:gutter="0"/>
       <w:cols w:space="720"/>
       <w:docGrid w:linePitch="360"/>
     </w:sectPr>
@@ -3980,7 +2822,7 @@
         <w:rFonts w:ascii="Calibri" w:hAnsi="Calibri" w:cs="Calibri"/>
         <w:sz w:val="18"/>
       </w:rPr>
-      <w:t xml:space="preserve">Cariqueo, Ariel  —  Proyecto APT La 200  —  Página </w:t>
+      <w:t xml:space="preserve">Ariel Cariqueo  —  Arquitectura y desarrollo  —  Página </w:t>
     </w:r>
     <w:r>
       <w:rPr>
@@ -4716,7 +3558,7 @@
     <w:link w:val="HeaderChar"/>
     <w:uiPriority w:val="99"/>
     <w:unhideWhenUsed/>
-    <w:rsid w:val="00283AFE"/>
+    <w:rsid w:val="00D810F6"/>
     <w:pPr>
       <w:tabs>
         <w:tab w:val="center" w:pos="4680"/>
@@ -4729,7 +3571,7 @@
     <w:basedOn w:val="DefaultParagraphFont"/>
     <w:link w:val="Header"/>
     <w:uiPriority w:val="99"/>
-    <w:rsid w:val="00283AFE"/>
+    <w:rsid w:val="00D810F6"/>
     <w:rPr>
       <w:rFonts w:eastAsiaTheme="minorEastAsia"/>
       <w:sz w:val="24"/>
@@ -4742,7 +3584,7 @@
     <w:link w:val="FooterChar"/>
     <w:uiPriority w:val="99"/>
     <w:unhideWhenUsed/>
-    <w:rsid w:val="00283AFE"/>
+    <w:rsid w:val="00D810F6"/>
     <w:pPr>
       <w:tabs>
         <w:tab w:val="center" w:pos="4680"/>
@@ -4755,7 +3597,7 @@
     <w:basedOn w:val="DefaultParagraphFont"/>
     <w:link w:val="Footer"/>
     <w:uiPriority w:val="99"/>
-    <w:rsid w:val="00283AFE"/>
+    <w:rsid w:val="00D810F6"/>
     <w:rPr>
       <w:rFonts w:eastAsiaTheme="minorEastAsia"/>
       <w:sz w:val="24"/>

</xml_diff>